<commit_message>
Resync the 4 reviewers and both decks to the NEWFINAL manuscript
The manuscript was substantially restructured: Agile replaces Waterfall
as the SDLC, the objectives collapsed from eight to three, the score
formula gained a fourth (certificates) component, the pipeline is
described as ten states, the Theoretical Framework was removed, and the
appendices grew from A-E to A-L.

All six documents rebuilt against that file, with system counts verified
against the repository rather than copied from the paper (232 tests
across 11 suites, 24 tables, 30 FKs, 56 endpoints, 104 skills / 223
vocabulary entries / 85 with synonyms). The manuscript reviewer also
lists ten defects still in the file, worst first.

Co-Authored-By: Claude Opus 5 <noreply@anthropic.com>
Claude-Session: https://claude.ai/code/session_01KJCBhwXyDj1kaiQWF9G7ZP
</commit_message>
<xml_diff>
--- a/05_Website_Angular/docs/reviewer-4/02_Manuscript_Reviewer.docx
+++ b/05_Website_Angular/docs/reviewer-4/02_Manuscript_Reviewer.docx
@@ -46,7 +46,7 @@
           <w:i/>
           <w:sz w:val="22"/>
         </w:rPr>
-        <w:t>This follows the ACTUAL sections in our manuscript, in the order they appear. Where a section a panel might expect does not exist yet, this document says so plainly instead of inventing it.</w:t>
+        <w:t>This follows the ACTUAL sections in the manuscript, in the order they appear, and it is rebuilt against LinawPHMAINPAPERupdatedNEWFINAL.docx. Where a section a panel might expect does not exist, this document says so plainly instead of inventing it.</w:t>
       </w:r>
     </w:p>
     <w:p>
@@ -54,61 +54,62 @@
         <w:pStyle w:val="Heading1"/>
       </w:pPr>
       <w:r>
-        <w:t>READ THIS BEFORE ANYTHING ELSE</w:t>
-      </w:r>
-    </w:p>
-    <w:p>
-      <w:pPr/>
-      <w:r>
-        <w:t>This is now out of date and the correction matters: the manuscript DOES have its results and conclusion. Summary of Findings, Conclusions and Recommendations are all written, and every one of the five evaluation instruments has been administered and reported. If an older printout says otherwise, it is stale.</w:t>
-      </w:r>
-    </w:p>
-    <w:p>
-      <w:pPr/>
-      <w:r>
-        <w:t>What the manuscript actually contains, in order:</w:t>
-      </w:r>
-    </w:p>
-    <w:p>
-      <w:pPr/>
-      <w:r>
-        <w:t>Introduction, Review of Related Literature, Theoretical and Conceptual Framework.</w:t>
-      </w:r>
-    </w:p>
-    <w:p>
-      <w:pPr/>
-      <w:r>
-        <w:t>Statement of the Problem (six research questions), Objectives, Significance, Scope and Delimitations, Limitations, Definition of Terms.</w:t>
-      </w:r>
-    </w:p>
-    <w:p>
-      <w:pPr/>
-      <w:r>
-        <w:t>Method (research design, requirement analysis, development, testing, sample, instruments, data gathering, data analysis, validity and reliability, ethics).</w:t>
-      </w:r>
-    </w:p>
-    <w:p>
-      <w:pPr/>
-      <w:r>
-        <w:t>Five results sections, one per instrument: Requirement-Analysis Survey, HR and Recruitment Survey, Job Seeker System Evaluation, HR System Evaluation, IT Expert Evaluation.</w:t>
-      </w:r>
-    </w:p>
-    <w:p>
-      <w:pPr/>
-      <w:r>
-        <w:t>Summary of Findings, Conclusions, Recommendations.</w:t>
-      </w:r>
-    </w:p>
-    <w:p>
-      <w:pPr/>
-      <w:r>
-        <w:t>References, and Appendices A, B and C.</w:t>
-      </w:r>
-    </w:p>
-    <w:p>
-      <w:pPr/>
-      <w:r>
-        <w:t>If the panel asks whether the study is complete: "Every research question has a results section and the conclusion draws on all five. What we don't yet have is chapter numbering, tables for the reported figures, and a complete front matter — those are formatting, not missing analysis."</w:t>
+        <w:t>READ THIS FIRST</w:t>
+      </w:r>
+    </w:p>
+    <w:p>
+      <w:r>
+        <w:rPr>
+          <w:b/>
+          <w:color w:val="C1272D"/>
+        </w:rPr>
+        <w:t>The manuscript was restructured since the previous reviewer pack. Four things a panelist could catch you on if you revise from the old version:</w:t>
+      </w:r>
+    </w:p>
+    <w:p>
+      <w:pPr>
+        <w:pStyle w:val="ListNumber"/>
+        <w:spacing w:after="60"/>
+      </w:pPr>
+      <w:r>
+        <w:t>The development model is AGILE, not Waterfall. It is in the abstract, the keywords, the Method, and Figure 2 is captioned "Agile Model".</w:t>
+      </w:r>
+    </w:p>
+    <w:p>
+      <w:pPr>
+        <w:pStyle w:val="ListNumber"/>
+        <w:spacing w:after="60"/>
+      </w:pPr>
+      <w:r>
+        <w:t>There are THREE objectives, not eight or nine. Results, Summary of Findings, Discussion and Conclusion are all organised around those three.</w:t>
+      </w:r>
+    </w:p>
+    <w:p>
+      <w:pPr>
+        <w:pStyle w:val="ListNumber"/>
+        <w:spacing w:after="60"/>
+      </w:pPr>
+      <w:r>
+        <w:t>There is NO Theoretical Framework section and no Gilliland citation. There is also no Statement of the Problem heading, no Significance of the Study heading, and no Definition of Terms heading. Do not go looking for them in the paper and do not promise them to the panel.</w:t>
+      </w:r>
+    </w:p>
+    <w:p>
+      <w:pPr>
+        <w:pStyle w:val="ListNumber"/>
+        <w:spacing w:after="60"/>
+      </w:pPr>
+      <w:r>
+        <w:t>The appendices now run A to L — twelve of them, including the Google Forms as respondents saw them, the alpha testing records, and photographs of the IT expert evaluation.</w:t>
+      </w:r>
+    </w:p>
+    <w:p>
+      <w:r>
+        <w:rPr>
+          <w:b w:val="0"/>
+          <w:i w:val="0"/>
+          <w:sz w:val="22"/>
+        </w:rPr>
+        <w:t>Section 4 of this document lists defects that are still in the file. Read it before you print.</w:t>
       </w:r>
     </w:p>
     <w:p>
@@ -116,7 +117,260 @@
         <w:pStyle w:val="Heading1"/>
       </w:pPr>
       <w:r>
-        <w:t>CHAPTER 1 SECTIONS</w:t>
+        <w:t>1. What the Manuscript Actually Contains, In Order</w:t>
+      </w:r>
+    </w:p>
+    <w:p>
+      <w:pPr>
+        <w:pStyle w:val="Heading2"/>
+      </w:pPr>
+      <w:r>
+        <w:t>Front matter</w:t>
+      </w:r>
+    </w:p>
+    <w:p>
+      <w:pPr>
+        <w:pStyle w:val="ListBullet"/>
+        <w:spacing w:after="60"/>
+      </w:pPr>
+      <w:r>
+        <w:t>Cover page (title, degree, researchers, March 2026).</w:t>
+      </w:r>
+    </w:p>
+    <w:p>
+      <w:pPr>
+        <w:pStyle w:val="ListBullet"/>
+        <w:spacing w:after="60"/>
+      </w:pPr>
+      <w:r>
+        <w:t>Approval Sheet — adviser Jeanky S. Mendez, DIT.</w:t>
+      </w:r>
+    </w:p>
+    <w:p>
+      <w:pPr>
+        <w:pStyle w:val="ListBullet"/>
+        <w:spacing w:after="60"/>
+      </w:pPr>
+      <w:r>
+        <w:t>Oral Examination — dated September 18, 2026, with placeholder lines for the Panel Chair and two Panel Members.</w:t>
+      </w:r>
+    </w:p>
+    <w:p>
+      <w:pPr>
+        <w:pStyle w:val="ListBullet"/>
+        <w:spacing w:after="60"/>
+      </w:pPr>
+      <w:r>
+        <w:t>Approval — Chris Almocera, DIT (Program Chairperson, Information Technology) and Marlon I. Tayag, DIT (Dean, School of Computing).</w:t>
+      </w:r>
+    </w:p>
+    <w:p>
+      <w:pPr>
+        <w:pStyle w:val="ListBullet"/>
+        <w:spacing w:after="60"/>
+      </w:pPr>
+      <w:r>
+        <w:t>Acknowledgement.</w:t>
+      </w:r>
+    </w:p>
+    <w:p>
+      <w:pPr>
+        <w:pStyle w:val="ListBullet"/>
+        <w:spacing w:after="60"/>
+      </w:pPr>
+      <w:r>
+        <w:t>Table of Contents (typed by hand, with static page numbers).</w:t>
+      </w:r>
+    </w:p>
+    <w:p>
+      <w:pPr>
+        <w:pStyle w:val="ListBullet"/>
+        <w:spacing w:after="60"/>
+      </w:pPr>
+      <w:r>
+        <w:t>List of Figures and Tables — ONE combined list, not separate lists.</w:t>
+      </w:r>
+    </w:p>
+    <w:p>
+      <w:pPr>
+        <w:pStyle w:val="ListBullet"/>
+        <w:spacing w:after="60"/>
+      </w:pPr>
+      <w:r>
+        <w:t>Title Page.</w:t>
+      </w:r>
+    </w:p>
+    <w:p>
+      <w:pPr>
+        <w:pStyle w:val="ListBullet"/>
+        <w:spacing w:after="60"/>
+      </w:pPr>
+      <w:r>
+        <w:t>Abstract, then Keywords.</w:t>
+      </w:r>
+    </w:p>
+    <w:p>
+      <w:pPr>
+        <w:pStyle w:val="Heading2"/>
+      </w:pPr>
+      <w:r>
+        <w:t>Body</w:t>
+      </w:r>
+    </w:p>
+    <w:p>
+      <w:pPr>
+        <w:pStyle w:val="ListBullet"/>
+        <w:spacing w:after="60"/>
+      </w:pPr>
+      <w:r>
+        <w:t>Introduction</w:t>
+      </w:r>
+    </w:p>
+    <w:p>
+      <w:pPr>
+        <w:pStyle w:val="ListBullet"/>
+        <w:spacing w:after="60"/>
+      </w:pPr>
+      <w:r>
+        <w:t>Review of Related Literature — five themes, ending in Synthesis and Research Gap</w:t>
+      </w:r>
+    </w:p>
+    <w:p>
+      <w:pPr>
+        <w:pStyle w:val="ListBullet"/>
+        <w:spacing w:after="60"/>
+      </w:pPr>
+      <w:r>
+        <w:t>Conceptual Framework — the Input-Process-Output model, Figure 1</w:t>
+      </w:r>
+    </w:p>
+    <w:p>
+      <w:pPr>
+        <w:pStyle w:val="ListBullet"/>
+        <w:spacing w:after="60"/>
+      </w:pPr>
+      <w:r>
+        <w:t>Objectives of the Study — one primary, three specific</w:t>
+      </w:r>
+    </w:p>
+    <w:p>
+      <w:pPr>
+        <w:pStyle w:val="ListBullet"/>
+        <w:spacing w:after="60"/>
+      </w:pPr>
+      <w:r>
+        <w:t>Scope and Delimitations</w:t>
+      </w:r>
+    </w:p>
+    <w:p>
+      <w:pPr>
+        <w:pStyle w:val="ListBullet"/>
+        <w:spacing w:after="60"/>
+      </w:pPr>
+      <w:r>
+        <w:t>Limitations of the Study</w:t>
+      </w:r>
+    </w:p>
+    <w:p>
+      <w:pPr>
+        <w:pStyle w:val="ListBullet"/>
+        <w:spacing w:after="60"/>
+      </w:pPr>
+      <w:r>
+        <w:t>Method — Requirement Analysis, Requirement Documentation, Design of Software/System/Product/Process, Project Timeline, Development and Testing, Sample and Setting, Instrument / Simulation Tool, Data Gathering Procedure, Data Analysis, Validity and Reliability of the Instrument, Ethical Consideration</w:t>
+      </w:r>
+    </w:p>
+    <w:p>
+      <w:pPr>
+        <w:pStyle w:val="ListBullet"/>
+        <w:spacing w:after="60"/>
+      </w:pPr>
+      <w:r>
+        <w:t>Results — Job Seeker Results, HR and Recruitment Personnel Results, IT Expert Results</w:t>
+      </w:r>
+    </w:p>
+    <w:p>
+      <w:pPr>
+        <w:pStyle w:val="ListBullet"/>
+        <w:spacing w:after="60"/>
+      </w:pPr>
+      <w:r>
+        <w:t>Summary of Findings</w:t>
+      </w:r>
+    </w:p>
+    <w:p>
+      <w:pPr>
+        <w:pStyle w:val="ListBullet"/>
+        <w:spacing w:after="60"/>
+      </w:pPr>
+      <w:r>
+        <w:t>Discussion</w:t>
+      </w:r>
+    </w:p>
+    <w:p>
+      <w:pPr>
+        <w:pStyle w:val="ListBullet"/>
+        <w:spacing w:after="60"/>
+      </w:pPr>
+      <w:r>
+        <w:t>Conclusion</w:t>
+      </w:r>
+    </w:p>
+    <w:p>
+      <w:pPr>
+        <w:pStyle w:val="ListBullet"/>
+        <w:spacing w:after="60"/>
+      </w:pPr>
+      <w:r>
+        <w:t>Recommendations — for the System, for the Partner Company, for Future Research</w:t>
+      </w:r>
+    </w:p>
+    <w:p>
+      <w:pPr>
+        <w:pStyle w:val="ListBullet"/>
+        <w:spacing w:after="60"/>
+      </w:pPr>
+      <w:r>
+        <w:t>References</w:t>
+      </w:r>
+    </w:p>
+    <w:p>
+      <w:pPr>
+        <w:pStyle w:val="ListBullet"/>
+        <w:spacing w:after="60"/>
+      </w:pPr>
+      <w:r>
+        <w:t>Appendices A to L</w:t>
+      </w:r>
+    </w:p>
+    <w:p>
+      <w:pPr>
+        <w:spacing w:after="60"/>
+      </w:pPr>
+      <w:r>
+        <w:rPr>
+          <w:b/>
+          <w:color w:val="16305C"/>
+        </w:rPr>
+        <w:t xml:space="preserve">Counts: </w:t>
+      </w:r>
+      <w:r>
+        <w:t>15 tables, 5 figures, 12 appendices, roughly 35,000 words in the body.</w:t>
+      </w:r>
+    </w:p>
+    <w:p>
+      <w:pPr>
+        <w:spacing w:after="60"/>
+      </w:pPr>
+      <w:r>
+        <w:rPr>
+          <w:b/>
+          <w:color w:val="16305C"/>
+        </w:rPr>
+        <w:t xml:space="preserve">If asked whether the study is complete: </w:t>
+      </w:r>
+      <w:r>
+        <w:t>"Every objective has a results section, every research question has an instrument behind it, and Summary of Findings, Discussion, Conclusion and Recommendations are all written. All five instruments have been administered and reported."</w:t>
       </w:r>
     </w:p>
     <w:p>
@@ -124,7 +378,15 @@
         <w:pStyle w:val="Heading1"/>
       </w:pPr>
       <w:r>
-        <w:t>Introduction / Background</w:t>
+        <w:t>2. Section by Section</w:t>
+      </w:r>
+    </w:p>
+    <w:p>
+      <w:pPr>
+        <w:pStyle w:val="Heading2"/>
+      </w:pPr>
+      <w:r>
+        <w:t>Abstract</w:t>
       </w:r>
     </w:p>
     <w:p>
@@ -139,13 +401,13 @@
         <w:t xml:space="preserve">What is this section about? </w:t>
       </w:r>
       <w:r>
-        <w:t>It explains why this study exists: what job hunting is like for new Filipino applicants, and why resumes and screening software are a problem for them.</w:t>
+        <w:t>A one-paragraph summary of the whole study, followed by keywords.</w:t>
       </w:r>
     </w:p>
     <w:p>
       <w:r>
         <w:rPr>
-          <w:b/>
+          <w:b w:val="0"/>
           <w:i w:val="0"/>
           <w:sz w:val="22"/>
         </w:rPr>
@@ -158,7 +420,7 @@
         <w:spacing w:after="60"/>
       </w:pPr>
       <w:r>
-        <w:t>Job applications moved from paper to digital.</w:t>
+        <w:t>States the two-sided problem, the guided builder, the parser-safe designs, and the rule-based formula.</w:t>
       </w:r>
     </w:p>
     <w:p>
@@ -167,7 +429,7 @@
         <w:spacing w:after="60"/>
       </w:pPr>
       <w:r>
-        <w:t>Fresh graduates struggle with formatting and with knowing what to write.</w:t>
+        <w:t>Says the same score and missing-skill breakdown go to BOTH sides, and that nothing is auto-rejected.</w:t>
       </w:r>
     </w:p>
     <w:p>
@@ -176,7 +438,7 @@
         <w:spacing w:after="60"/>
       </w:pPr>
       <w:r>
-        <w:t>Good resume tools cost money that entry-level applicants often do not have.</w:t>
+        <w:t>Names the Agile Model as the System Development Life Cycle.</w:t>
       </w:r>
     </w:p>
     <w:p>
@@ -185,13 +447,22 @@
         <w:spacing w:after="60"/>
       </w:pPr>
       <w:r>
-        <w:t>Companies use ATS software that filters resumes before a person sees them.</w:t>
+        <w:t>Names ISO/IEC 25010, the quantitative descriptive design, the three respondent groups, and the Data Privacy Act.</w:t>
+      </w:r>
+    </w:p>
+    <w:p>
+      <w:pPr>
+        <w:pStyle w:val="ListBullet"/>
+        <w:spacing w:after="60"/>
+      </w:pPr>
+      <w:r>
+        <w:t>Ends by saying the study evaluates the system's QUALITY and reception, not whether it leads to employment.</w:t>
       </w:r>
     </w:p>
     <w:p>
       <w:r>
         <w:rPr>
-          <w:b/>
+          <w:b w:val="0"/>
           <w:i w:val="0"/>
           <w:sz w:val="22"/>
         </w:rPr>
@@ -204,7 +475,7 @@
         <w:spacing w:after="60"/>
       </w:pPr>
       <w:r>
-        <w:t>The problem has two sides: applicants and recruiters.</w:t>
+        <w:t>"Agile Model" is one of the eight keywords. If you say Waterfall on the day, you contradict your own abstract.</w:t>
       </w:r>
     </w:p>
     <w:p>
@@ -213,7 +484,7 @@
         <w:spacing w:after="60"/>
       </w:pPr>
       <w:r>
-        <w:t>Money is a real barrier, not an assumed one — our survey showed 80.4% of our target group never paid for resume help.</w:t>
+        <w:t>The last sentence is your shield against "did anyone get hired?" — the abstract already says that is out of scope.</w:t>
       </w:r>
     </w:p>
     <w:p>
@@ -228,7 +499,7 @@
         <w:t xml:space="preserve">How to explain it to the panel: </w:t>
       </w:r>
       <w:r>
-        <w:t>"New Filipino job seekers have two problems at once. Making a good resume is hard and the good tools cost money. And when they apply, software often filters them out before a person reads it, and nobody tells them why. Recruiters have the matching problem from the other side: screening by hand takes long, and proper software is expensive."</w:t>
+        <w:t>"The abstract states the problem on both sides, what we built, that the score is transparent to the applicant as well as the recruiter, that we built it with Agile, and that we evaluated quality against ISO 25010 with three respondent groups."</w:t>
       </w:r>
     </w:p>
     <w:p>
@@ -243,7 +514,7 @@
         <w:t xml:space="preserve">Possible question: </w:t>
       </w:r>
       <w:r>
-        <w:t>Why is this problem important?</w:t>
+        <w:t>Your abstract says the study examines how the formula affects "accuracy and perceived fairness" and how the dashboard affects "speed and consistency". Where are those measured?</w:t>
       </w:r>
     </w:p>
     <w:p>
@@ -258,15 +529,15 @@
         <w:t xml:space="preserve">Simple answer: </w:t>
       </w:r>
       <w:r>
-        <w:t>"Because if an applicant is filtered out and never told the reason, they cannot improve. They keep failing without knowing why. Our survey showed people feel this: worry about being rejected by a computer averaged 3.93 out of 5."</w:t>
-      </w:r>
-    </w:p>
-    <w:p>
-      <w:pPr>
-        <w:pStyle w:val="Heading1"/>
-      </w:pPr>
-      <w:r>
-        <w:t>Review of Related Literature</w:t>
+        <w:t>"That sentence describes the design intent rather than a measured outcome, and it is the one line in the abstract I would tighten. What we actually measured is in Table 15: functional suitability, usability and reliability from two user groups, plus security and maintainability from the experts. The nearest thing to a speed measure is the recruiter item on whether the ranked list was quicker than current practice, and I want to be honest that it was the joint-lowest item at 4.00."</w:t>
+      </w:r>
+    </w:p>
+    <w:p>
+      <w:pPr>
+        <w:pStyle w:val="Heading2"/>
+      </w:pPr>
+      <w:r>
+        <w:t>Introduction</w:t>
       </w:r>
     </w:p>
     <w:p>
@@ -281,13 +552,13 @@
         <w:t xml:space="preserve">What is this section about? </w:t>
       </w:r>
       <w:r>
-        <w:t>It reviews what other people have already written and built, and shows the gap our study fills.</w:t>
+        <w:t>Why this study exists: what job hunting is like for new Filipino applicants, and why resumes and screening software are a problem for them.</w:t>
       </w:r>
     </w:p>
     <w:p>
       <w:r>
         <w:rPr>
-          <w:b/>
+          <w:b w:val="0"/>
           <w:i w:val="0"/>
           <w:sz w:val="22"/>
         </w:rPr>
@@ -300,7 +571,7 @@
         <w:spacing w:after="60"/>
       </w:pPr>
       <w:r>
-        <w:t>Covers job seeker background, resume quality and ATS compatibility, existing resume-building tools, ATS and parsing from the recruiter side, and job matching systems.</w:t>
+        <w:t>Job applications moved to digital; most commercial builders paywall their core features.</w:t>
       </w:r>
     </w:p>
     <w:p>
@@ -309,13 +580,40 @@
         <w:spacing w:after="60"/>
       </w:pPr>
       <w:r>
-        <w:t>Ends with a Synthesis and Research Gap section.</w:t>
+        <w:t>Most medium-to-large employers use an ATS that filters before a human reads (Leony et al., 2024).</w:t>
+      </w:r>
+    </w:p>
+    <w:p>
+      <w:pPr>
+        <w:pStyle w:val="ListBullet"/>
+        <w:spacing w:after="60"/>
+      </w:pPr>
+      <w:r>
+        <w:t>Fresh graduates struggle to identify which openings actually match them, producing low callbacks and skills mismatch (ILO, 2024; PSA, 2023).</w:t>
+      </w:r>
+    </w:p>
+    <w:p>
+      <w:pPr>
+        <w:pStyle w:val="ListBullet"/>
+        <w:spacing w:after="60"/>
+      </w:pPr>
+      <w:r>
+        <w:t>Existing platforms only half-solve it: JobStreet, Indeed and LinkedIn are keyword listing sites that assume you already know what to search; PhilJobNet has limited reach; Canva and Zety are not built for ATS compatibility or the Philippine context (Wan Hanafi et al., 2022).</w:t>
+      </w:r>
+    </w:p>
+    <w:p>
+      <w:pPr>
+        <w:pStyle w:val="ListBullet"/>
+        <w:spacing w:after="60"/>
+      </w:pPr>
+      <w:r>
+        <w:t>Ends by naming the three user types and describing the matching feature and the tiers.</w:t>
       </w:r>
     </w:p>
     <w:p>
       <w:r>
         <w:rPr>
-          <w:b/>
+          <w:b w:val="0"/>
           <w:i w:val="0"/>
           <w:sz w:val="22"/>
         </w:rPr>
@@ -328,7 +626,7 @@
         <w:spacing w:after="60"/>
       </w:pPr>
       <w:r>
-        <w:t>The gap: existing tools either build a resume OR match jobs. They rarely do both, and they almost never show the applicant the same score the employer sees.</w:t>
+        <w:t>The gap sentence: no free, locally oriented platform closes BOTH gaps — producing an ATS-compatible resume AND matching it to real openings with a transparent score.</w:t>
       </w:r>
     </w:p>
     <w:p>
@@ -337,7 +635,7 @@
         <w:spacing w:after="60"/>
       </w:pPr>
       <w:r>
-        <w:t>Most existing tools are also paid, or made for foreign job markets.</w:t>
+        <w:t>Money is a real barrier, not an assumed one: 80.4% of our target group never paid for resume help.</w:t>
       </w:r>
     </w:p>
     <w:p>
@@ -352,7 +650,7 @@
         <w:t xml:space="preserve">How to explain it to the panel: </w:t>
       </w:r>
       <w:r>
-        <w:t>"The literature shows resume builders and job matching systems exist separately. What is missing is a tool that joins them and is honest with the applicant about the score. That is our gap."</w:t>
+        <w:t>"New Filipino job seekers have two problems at once. Making a good resume is hard and the good tools cost money. And when they apply, software often filters them out before a person reads it, and nobody tells them why. Recruiters have the same problem from the other side: screening by hand takes long, and proper software is expensive."</w:t>
       </w:r>
     </w:p>
     <w:p>
@@ -367,7 +665,7 @@
         <w:t xml:space="preserve">Possible question: </w:t>
       </w:r>
       <w:r>
-        <w:t>What makes your study different from existing resume builders?</w:t>
+        <w:t>Why is this problem important?</w:t>
       </w:r>
     </w:p>
     <w:p>
@@ -382,15 +680,15 @@
         <w:t xml:space="preserve">Simple answer: </w:t>
       </w:r>
       <w:r>
-        <w:t>"Two things. We join resume building and job matching in one free system. And we show the applicant the same score the recruiter sees, with the reason. Most tools either charge for that or never show it at all."</w:t>
-      </w:r>
-    </w:p>
-    <w:p>
-      <w:pPr>
-        <w:pStyle w:val="Heading1"/>
-      </w:pPr>
-      <w:r>
-        <w:t>Theoretical Framework</w:t>
+        <w:t>"Because if an applicant is filtered out and never told the reason, they cannot improve. They keep failing without knowing why. Our own survey showed people feel this: worry about being rejected by a computer averaged 3.93 out of 5 in our target group."</w:t>
+      </w:r>
+    </w:p>
+    <w:p>
+      <w:pPr>
+        <w:pStyle w:val="Heading2"/>
+      </w:pPr>
+      <w:r>
+        <w:t>Review of Related Literature</w:t>
       </w:r>
     </w:p>
     <w:p>
@@ -405,13 +703,13 @@
         <w:t xml:space="preserve">What is this section about? </w:t>
       </w:r>
       <w:r>
-        <w:t>The theory we borrowed to explain why fairness in hiring matters.</w:t>
+        <w:t>What others have written and built, and the gap our study fills.</w:t>
       </w:r>
     </w:p>
     <w:p>
       <w:r>
         <w:rPr>
-          <w:b/>
+          <w:b w:val="0"/>
           <w:i w:val="0"/>
           <w:sz w:val="22"/>
         </w:rPr>
@@ -424,7 +722,7 @@
         <w:spacing w:after="60"/>
       </w:pPr>
       <w:r>
-        <w:t>Based on Gilliland (1993), on organisational justice in selection.</w:t>
+        <w:t>Five themes: background and challenges of Filipino job seekers; resume quality, formatting and ATS compatibility; research on resume building technologies; ATS and resume parsing from the recruiter side; and job matching and recommendation systems.</w:t>
       </w:r>
     </w:p>
     <w:p>
@@ -433,7 +731,7 @@
         <w:spacing w:after="60"/>
       </w:pPr>
       <w:r>
-        <w:t>It says applicants judge a hiring process as fair or unfair, and that judgement matters.</w:t>
+        <w:t>Opens by defining the key terms — web-based resume builder, ATS, ATS optimisation, resume parsing, ATS-inspired job matching, and job seeking in the Philippines.</w:t>
       </w:r>
     </w:p>
     <w:p>
@@ -442,13 +740,13 @@
         <w:spacing w:after="60"/>
       </w:pPr>
       <w:r>
-        <w:t>Our system responds to it by being transparent: publish the weights, show the score, give a reason.</w:t>
+        <w:t>Ends with Synthesis and Research Gap.</w:t>
       </w:r>
     </w:p>
     <w:p>
       <w:r>
         <w:rPr>
-          <w:b/>
+          <w:b w:val="0"/>
           <w:i w:val="0"/>
           <w:sz w:val="22"/>
         </w:rPr>
@@ -461,7 +759,7 @@
         <w:spacing w:after="60"/>
       </w:pPr>
       <w:r>
-        <w:t>Name to remember: Gilliland, 1993.</w:t>
+        <w:t>The key terms are defined HERE, at the top of the RRL. There is no separate Definition of Terms section, so if a panelist asks where your terms are defined, point at the start of the literature review.</w:t>
       </w:r>
     </w:p>
     <w:p>
@@ -470,7 +768,7 @@
         <w:spacing w:after="60"/>
       </w:pPr>
       <w:r>
-        <w:t>The idea: people accept a decision more readily when the process is explained.</w:t>
+        <w:t>The gap: existing tools either build a resume OR match jobs. They rarely do both, and they almost never show the applicant the same score the employer sees.</w:t>
       </w:r>
     </w:p>
     <w:p>
@@ -485,7 +783,7 @@
         <w:t xml:space="preserve">How to explain it to the panel: </w:t>
       </w:r>
       <w:r>
-        <w:t>"Gilliland says applicants form a judgement about whether a selection process was fair, and that explanations and transparency drive that judgement. Our system is built directly on that: we publish the weights, we show the applicant the same score, and we tell them what was missing."</w:t>
+        <w:t>"The literature shows resume builders and job matching systems exist separately. What is missing is a tool that joins them and is honest with the applicant about the score. That is our gap."</w:t>
       </w:r>
     </w:p>
     <w:p>
@@ -500,7 +798,7 @@
         <w:t xml:space="preserve">Possible question: </w:t>
       </w:r>
       <w:r>
-        <w:t>Why did you choose this theory?</w:t>
+        <w:t>What makes your study different from existing resume builders?</w:t>
       </w:r>
     </w:p>
     <w:p>
@@ -515,12 +813,12 @@
         <w:t xml:space="preserve">Simple answer: </w:t>
       </w:r>
       <w:r>
-        <w:t>"Because our core design decision is transparency, and this theory is about exactly that: whether an applicant thinks the process was fair, and what makes them think so."</w:t>
-      </w:r>
-    </w:p>
-    <w:p>
-      <w:pPr>
-        <w:pStyle w:val="Heading1"/>
+        <w:t>"Two things. We join resume building and job matching in one free system. And we show the applicant the same score the recruiter sees, with the reason. Most tools either charge for that or never show it at all."</w:t>
+      </w:r>
+    </w:p>
+    <w:p>
+      <w:pPr>
+        <w:pStyle w:val="Heading2"/>
       </w:pPr>
       <w:r>
         <w:t>Conceptual Framework</w:t>
@@ -538,13 +836,13 @@
         <w:t xml:space="preserve">What is this section about? </w:t>
       </w:r>
       <w:r>
-        <w:t>A picture of how our study works: what goes in, what the system does, and what comes out.</w:t>
+        <w:t>How the study works: what goes in, what the system does, and what comes out. Figure 1 is the Input-Process-Output model.</w:t>
       </w:r>
     </w:p>
     <w:p>
       <w:r>
         <w:rPr>
-          <w:b/>
+          <w:b w:val="0"/>
           <w:i w:val="0"/>
           <w:sz w:val="22"/>
         </w:rPr>
@@ -557,7 +855,7 @@
         <w:spacing w:after="60"/>
       </w:pPr>
       <w:r>
-        <w:t>Input: the applicant's resume data and the recruiter's job requirements.</w:t>
+        <w:t>One proposition: the difficulty is not only that new job seekers cannot produce a well-formed resume, but that they cannot see how their application is judged.</w:t>
       </w:r>
     </w:p>
     <w:p>
@@ -566,7 +864,7 @@
         <w:spacing w:after="60"/>
       </w:pPr>
       <w:r>
-        <w:t>Process: the weighted comparison of skills, education and experience.</w:t>
+        <w:t>Two conditions produce the problem — unstructured input, and opaque assessment.</w:t>
       </w:r>
     </w:p>
     <w:p>
@@ -575,13 +873,31 @@
         <w:spacing w:after="60"/>
       </w:pPr>
       <w:r>
-        <w:t>Output: a score, a tier, a ranked list for the recruiter, and an explanation for the applicant.</w:t>
+        <w:t>INPUT has five components: resume structure and design (3 formats, 14 designs); job seeker information; recruiter and company information; educational resources; and the matching criteria (canonical vocabulary, default weights, tier thresholds).</w:t>
+      </w:r>
+    </w:p>
+    <w:p>
+      <w:pPr>
+        <w:pStyle w:val="ListBullet"/>
+        <w:spacing w:after="60"/>
+      </w:pPr>
+      <w:r>
+        <w:t>PROCESS is the five development phases.</w:t>
+      </w:r>
+    </w:p>
+    <w:p>
+      <w:pPr>
+        <w:pStyle w:val="ListBullet"/>
+        <w:spacing w:after="60"/>
+      </w:pPr>
+      <w:r>
+        <w:t>OUTPUT is the web application with its three account types, the matching engine, and the evaluation results.</w:t>
       </w:r>
     </w:p>
     <w:p>
       <w:r>
         <w:rPr>
-          <w:b/>
+          <w:b w:val="0"/>
           <w:i w:val="0"/>
           <w:sz w:val="22"/>
         </w:rPr>
@@ -595,6 +911,24 @@
       </w:pPr>
       <w:r>
         <w:t>Input, Process, Output. That is the shape of it.</w:t>
+      </w:r>
+    </w:p>
+    <w:p>
+      <w:pPr>
+        <w:pStyle w:val="ListBullet"/>
+        <w:spacing w:after="60"/>
+      </w:pPr>
+      <w:r>
+        <w:t>The framework claims the two fixes only work TOGETHER: structured input makes the applicant legible to the software and the recruiter; an explained score makes the assessment legible to the applicant.</w:t>
+      </w:r>
+    </w:p>
+    <w:p>
+      <w:pPr>
+        <w:pStyle w:val="ListBullet"/>
+        <w:spacing w:after="60"/>
+      </w:pPr>
+      <w:r>
+        <w:t>There is NO separate Theoretical Framework section in this manuscript. If asked for your theory, talk about this proposition and the ISO/IEC 25010 quality model, which is what actually supplies your evaluation criteria.</w:t>
       </w:r>
     </w:p>
     <w:p>
@@ -609,7 +943,7 @@
         <w:t xml:space="preserve">How to explain it to the panel: </w:t>
       </w:r>
       <w:r>
-        <w:t>"The inputs are the applicant's structured resume and the requirements the recruiter stated. The process is our weighted formula. The outputs are the score with its explanation for the applicant, and the ranked list for the recruiter."</w:t>
+        <w:t>"The applicant's structured resume and the recruiter's stated requirements go in. The process is our weighted formula. Out comes a score with its explanation for the applicant, and a ranked, inspectable list for the recruiter."</w:t>
       </w:r>
     </w:p>
     <w:p>
@@ -624,7 +958,7 @@
         <w:t xml:space="preserve">Possible question: </w:t>
       </w:r>
       <w:r>
-        <w:t>Explain your conceptual framework.</w:t>
+        <w:t>What theory underpins your study?</w:t>
       </w:r>
     </w:p>
     <w:p>
@@ -639,21 +973,7 @@
         <w:t xml:space="preserve">Simple answer: </w:t>
       </w:r>
       <w:r>
-        <w:t>"The applicant's resume and the recruiter's requirements go in. Our formula compares them: 50 percent skills, 25 percent education, 25 percent experience. Out comes a score, a tier, an explanation for the applicant, and a ranked list for the recruiter."</w:t>
-      </w:r>
-    </w:p>
-    <w:p>
-      <w:pPr>
-        <w:pStyle w:val="Heading1"/>
-      </w:pPr>
-      <w:r>
-        <w:t>Statement of the Problem</w:t>
-      </w:r>
-    </w:p>
-    <w:p>
-      <w:pPr/>
-      <w:r>
-        <w:t>What is this section about? The exact questions our study answers. There are SIX now, not seven — a seventh question about ranking agreement was removed along with the instrument that would have measured it (see Research Instruments and the mismatches section near the end of this document).</w:t>
+        <w:t>"The framework rests on a stated proposition rather than a borrowed theory: that unstructured input and opaque assessment together produce the problem, and that addressing both produces an effect neither alone would. The evaluation criteria come from a standard rather than a theory — ISO/IEC 25010, which is what defines the five characteristics we measured."</w:t>
       </w:r>
     </w:p>
     <w:p>
@@ -661,209 +981,7 @@
         <w:pStyle w:val="Heading2"/>
       </w:pPr>
       <w:r>
-        <w:t>Key points</w:t>
-      </w:r>
-    </w:p>
-    <w:p>
-      <w:pPr/>
-      <w:r>
-        <w:t>Q1: How do job seekers rate the difficulty of making a resume, and which part is hardest?</w:t>
-      </w:r>
-    </w:p>
-    <w:p>
-      <w:pPr/>
-      <w:r>
-        <w:t>Q2: How do job seekers rate their ability to judge whether they qualify for an opening?</w:t>
-      </w:r>
-    </w:p>
-    <w:p>
-      <w:pPr/>
-      <w:r>
-        <w:t>Q3: How do HR personnel rate their current screening, and how do they split importance across skills, education and experience?</w:t>
-      </w:r>
-    </w:p>
-    <w:p>
-      <w:pPr/>
-      <w:r>
-        <w:t>Q4: How do job seekers rate the system for functional suitability, usability and reliability?</w:t>
-      </w:r>
-    </w:p>
-    <w:p>
-      <w:pPr/>
-      <w:r>
-        <w:t>Q5: How do HR personnel rate the system on the same three?</w:t>
-      </w:r>
-    </w:p>
-    <w:p>
-      <w:pPr/>
-      <w:r>
-        <w:t>Q6: How do IT experts rate the system, including security and maintainability?</w:t>
-      </w:r>
-    </w:p>
-    <w:p>
-      <w:pPr>
-        <w:pStyle w:val="Heading2"/>
-      </w:pPr>
-      <w:r>
-        <w:t>What should I remember?</w:t>
-      </w:r>
-    </w:p>
-    <w:p>
-      <w:pPr/>
-      <w:r>
-        <w:t>Six questions. Q1 to Q3 are BEFORE the system (requirement analysis). Q4 to Q6 are AFTER (evaluation).</w:t>
-      </w:r>
-    </w:p>
-    <w:p>
-      <w:pPr/>
-      <w:r>
-        <w:t>ALL SIX ARE NOW ANSWERED WITH REAL DATA. This is the single biggest change since the last version of this reviewer — every research question has a results section.</w:t>
-      </w:r>
-    </w:p>
-    <w:p>
-      <w:pPr/>
-      <w:r>
-        <w:t>How to explain it to the panel: "We have six questions. The first three describe the problem as job seekers and recruiters experience it now, answered by our requirement-analysis surveys. The last three ask how job seekers, HR personnel, and IT experts rate the finished system, each answered by its own evaluation instrument."</w:t>
-      </w:r>
-    </w:p>
-    <w:p>
-      <w:pPr/>
-      <w:r>
-        <w:t>Possible question: Which of your questions have you actually answered?</w:t>
-      </w:r>
-    </w:p>
-    <w:p>
-      <w:pPr/>
-      <w:r>
-        <w:t>Simple answer: "All six. Questions 1 to 3 come from Instruments A and B, collected before the system was finished. Questions 4 to 6 come from Instruments C, D and E, collected after."</w:t>
-      </w:r>
-    </w:p>
-    <w:p>
-      <w:pPr/>
-      <w:r>
-        <w:t>Possible question: Didn't you have a seventh question about ranking agreement?</w:t>
-      </w:r>
-    </w:p>
-    <w:p>
-      <w:pPr/>
-      <w:r>
-        <w:t>Simple answer: "We planned one. The instrument that would have measured it was never administered with data we were confident in, so we withdrew the question along with the instrument rather than leave a claim we couldn't back up. It isn't in the paper anymore, in the research questions or anywhere else."</w:t>
-      </w:r>
-    </w:p>
-    <w:p>
-      <w:pPr>
-        <w:pStyle w:val="Heading1"/>
-      </w:pPr>
-      <w:r>
         <w:t>Objectives of the Study</w:t>
-      </w:r>
-    </w:p>
-    <w:p>
-      <w:pPr/>
-      <w:r>
-        <w:t>What is this section about? What we set out to build and do. There are EIGHT specific objectives under one primary objective.</w:t>
-      </w:r>
-    </w:p>
-    <w:p>
-      <w:pPr>
-        <w:pStyle w:val="Heading2"/>
-      </w:pPr>
-      <w:r>
-        <w:t>Key points</w:t>
-      </w:r>
-    </w:p>
-    <w:p>
-      <w:pPr/>
-      <w:r>
-        <w:t>Build the resume builder with three formats and fourteen designs.</w:t>
-      </w:r>
-    </w:p>
-    <w:p>
-      <w:pPr/>
-      <w:r>
-        <w:t>Put learning materials inside the system.</w:t>
-      </w:r>
-    </w:p>
-    <w:p>
-      <w:pPr/>
-      <w:r>
-        <w:t>Build the Job Seeker account.</w:t>
-      </w:r>
-    </w:p>
-    <w:p>
-      <w:pPr/>
-      <w:r>
-        <w:t>Build the Recruiter/HR account.</w:t>
-      </w:r>
-    </w:p>
-    <w:p>
-      <w:pPr/>
-      <w:r>
-        <w:t>Build the Administrator account.</w:t>
-      </w:r>
-    </w:p>
-    <w:p>
-      <w:pPr/>
-      <w:r>
-        <w:t>Build the ATS-inspired matching feature with configurable weights.</w:t>
-      </w:r>
-    </w:p>
-    <w:p>
-      <w:pPr/>
-      <w:r>
-        <w:t>Make it accessible: simple, mobile, light and dark, replayable tutorial.</w:t>
-      </w:r>
-    </w:p>
-    <w:p>
-      <w:pPr/>
-      <w:r>
-        <w:t>Protect accounts and data under the Data Privacy Act of 2012.</w:t>
-      </w:r>
-    </w:p>
-    <w:p>
-      <w:pPr>
-        <w:pStyle w:val="Heading2"/>
-      </w:pPr>
-      <w:r>
-        <w:t>What should I remember?</w:t>
-      </w:r>
-    </w:p>
-    <w:p>
-      <w:pPr/>
-      <w:r>
-        <w:t>Eight objectives, all achieved with evidence, though two rest on lighter evidence than the rest and the paper says so. Six are supported directly by the evaluation instruments: the resume builder and its learning materials by usage figures in Instrument C, the job seeker and recruiter accounts by task completion in both post-use instruments, the matching feature by functional suitability ratings in three separate instruments (4.30, 4.17, 4.78), and testing by 232 automated tests plus five respondent-based evaluations.</w:t>
-      </w:r>
-    </w:p>
-    <w:p>
-      <w:pPr/>
-      <w:r>
-        <w:t>The Administrator account has no instrument behind it. None of the three respondent groups — job seekers, HR personnel, IT experts — holds that role, so no evaluation instrument rates it. This is a real, acknowledged gap, not a mistake to hide: if asked, say so plainly. Accessibility is addressed in the design and Instrument C records some device data, but no instrument asks a low-experience user directly whether they found the system usable.</w:t>
-      </w:r>
-    </w:p>
-    <w:p>
-      <w:pPr/>
-      <w:r>
-        <w:t>How to explain it to the panel: "We have eight objectives under one primary objective. Six are supported by direct evidence from our evaluation instruments. Two — the administrator account and the accessibility claim specifically for low-experience users — don't have a dedicated instrument behind them, and we say so rather than claim more than we measured."</w:t>
-      </w:r>
-    </w:p>
-    <w:p>
-      <w:pPr/>
-      <w:r>
-        <w:t>Possible question: Did you achieve your objectives?</w:t>
-      </w:r>
-    </w:p>
-    <w:p>
-      <w:pPr/>
-      <w:r>
-        <w:t>Simple answer: "Yes, with two of the eight resting on lighter evidence than the rest. Everything else is demonstrated live and backed by a specific figure from an evaluation instrument."</w:t>
-      </w:r>
-    </w:p>
-    <w:p>
-      <w:pPr>
-        <w:pStyle w:val="Heading1"/>
-      </w:pPr>
-      <w:r>
-        <w:t>Significance of the Study</w:t>
       </w:r>
     </w:p>
     <w:p>
@@ -878,13 +996,13 @@
         <w:t xml:space="preserve">What is this section about? </w:t>
       </w:r>
       <w:r>
-        <w:t>Who benefits and how.</w:t>
+        <w:t>What we set out to build and do. One primary objective and THREE specific ones.</w:t>
       </w:r>
     </w:p>
     <w:p>
       <w:r>
         <w:rPr>
-          <w:b/>
+          <w:b w:val="0"/>
           <w:i w:val="0"/>
           <w:sz w:val="22"/>
         </w:rPr>
@@ -897,7 +1015,7 @@
         <w:spacing w:after="60"/>
       </w:pPr>
       <w:r>
-        <w:t>New job seekers: a free guided builder and an honest score.</w:t>
+        <w:t>Primary: design, develop and evaluate a system connecting Filipino job seekers with the HR departments of partner companies, bridging two gaps at once.</w:t>
       </w:r>
     </w:p>
     <w:p>
@@ -906,7 +1024,7 @@
         <w:spacing w:after="60"/>
       </w:pPr>
       <w:r>
-        <w:t>HR personnel: applications arrive structured, scored and ranked.</w:t>
+        <w:t>Specific 1: develop the web application — resume builder, recruiter dashboard, learning hub, AI-assisted extraction.</w:t>
       </w:r>
     </w:p>
     <w:p>
@@ -915,7 +1033,7 @@
         <w:spacing w:after="60"/>
       </w:pPr>
       <w:r>
-        <w:t>Clark Outsourcing: a system fitted to their own hiring across several departments.</w:t>
+        <w:t>Specific 2: implement the ATS-inspired matching feature with a transparent rule-based score and related-position recommendations, shown to BOTH sides.</w:t>
       </w:r>
     </w:p>
     <w:p>
@@ -924,22 +1042,13 @@
         <w:spacing w:after="60"/>
       </w:pPr>
       <w:r>
-        <w:t>Holy Angel University: a documented system and a record of the design decisions.</w:t>
-      </w:r>
-    </w:p>
-    <w:p>
-      <w:pPr>
-        <w:pStyle w:val="ListBullet"/>
-        <w:spacing w:after="60"/>
-      </w:pPr>
-      <w:r>
-        <w:t>Future researchers: a simple, fully documented baseline to compare against.</w:t>
+        <w:t>Specific 3: evaluate using ISO/IEC 25010 — job seekers and HR on functional suitability, usability and reliability; IT experts additionally on security and maintainability.</w:t>
       </w:r>
     </w:p>
     <w:p>
       <w:r>
         <w:rPr>
-          <w:b/>
+          <w:b w:val="0"/>
           <w:i w:val="0"/>
           <w:sz w:val="22"/>
         </w:rPr>
@@ -952,7 +1061,25 @@
         <w:spacing w:after="60"/>
       </w:pPr>
       <w:r>
-        <w:t>Five groups. Applicants, recruiters, the partner company, the university, future researchers.</w:t>
+        <w:t>THREE. Build it, match with it, measure it.</w:t>
+      </w:r>
+    </w:p>
+    <w:p>
+      <w:pPr>
+        <w:pStyle w:val="ListBullet"/>
+        <w:spacing w:after="60"/>
+      </w:pPr>
+      <w:r>
+        <w:t>Every later section is organised by these three. Summary of Findings has one paragraph per objective. Discussion has one block per objective. Conclusion has one paragraph per objective.</w:t>
+      </w:r>
+    </w:p>
+    <w:p>
+      <w:pPr>
+        <w:pStyle w:val="ListBullet"/>
+        <w:spacing w:after="60"/>
+      </w:pPr>
+      <w:r>
+        <w:t>The Administrator account is inside Objective 1 but has no respondent group, because the research team operates it. The paper says so, under Sample and Setting.</w:t>
       </w:r>
     </w:p>
     <w:p>
@@ -967,7 +1094,7 @@
         <w:t xml:space="preserve">How to explain it to the panel: </w:t>
       </w:r>
       <w:r>
-        <w:t>"It helps five groups. Applicants get a free tool and an honest score. Recruiters save first-pass screening time. Our partner gets a system fitted to how they hire. The university gets a documented system. Future researchers get a simple baseline they can compare against."</w:t>
+        <w:t>"We have one primary objective and three specific ones: build the system, implement the transparent matching feature, and evaluate the result against ISO 25010 with three respondent groups."</w:t>
       </w:r>
     </w:p>
     <w:p>
@@ -982,7 +1109,7 @@
         <w:t xml:space="preserve">Possible question: </w:t>
       </w:r>
       <w:r>
-        <w:t>Who benefits most?</w:t>
+        <w:t>Did you achieve your objectives?</w:t>
       </w:r>
     </w:p>
     <w:p>
@@ -997,12 +1124,42 @@
         <w:t xml:space="preserve">Simple answer: </w:t>
       </w:r>
       <w:r>
-        <w:t>"The new job seeker, because for them the alternative is paying for a tool or being rejected in silence."</w:t>
-      </w:r>
-    </w:p>
-    <w:p>
-      <w:pPr>
-        <w:pStyle w:val="Heading1"/>
+        <w:t>"All three, and each has evidence. Objective 1: every module was built and exercised by real respondents. Objective 2: screening awareness fell from 3.93 to 2.65 with a large effect, and all ten recruiters put our top-ranked applicant in their own top three. Objective 3: all five characteristics were rated, and the figures are in Table 15."</w:t>
+      </w:r>
+    </w:p>
+    <w:p>
+      <w:pPr>
+        <w:spacing w:after="60"/>
+      </w:pPr>
+      <w:r>
+        <w:rPr>
+          <w:b/>
+          <w:color w:val="16305C"/>
+        </w:rPr>
+        <w:t xml:space="preserve">Possible question: </w:t>
+      </w:r>
+      <w:r>
+        <w:t>Only three objectives seems few for a capstone. Why?</w:t>
+      </w:r>
+    </w:p>
+    <w:p>
+      <w:pPr>
+        <w:spacing w:after="60"/>
+      </w:pPr>
+      <w:r>
+        <w:rPr>
+          <w:b/>
+          <w:color w:val="16305C"/>
+        </w:rPr>
+        <w:t xml:space="preserve">Simple answer: </w:t>
+      </w:r>
+      <w:r>
+        <w:t>"They are broad rather than few. Objective 1 covers the whole system — three account types, the builder, the learning hub, the dashboard and the extraction feature. What matters is that each one is testable and each one has a results section behind it, rather than having a longer list where some items have no evidence."</w:t>
+      </w:r>
+    </w:p>
+    <w:p>
+      <w:pPr>
+        <w:pStyle w:val="Heading2"/>
       </w:pPr>
       <w:r>
         <w:t>Scope and Delimitations</w:t>
@@ -1026,7 +1183,7 @@
     <w:p>
       <w:r>
         <w:rPr>
-          <w:b/>
+          <w:b w:val="0"/>
           <w:i w:val="0"/>
           <w:sz w:val="22"/>
         </w:rPr>
@@ -1039,7 +1196,7 @@
         <w:spacing w:after="60"/>
       </w:pPr>
       <w:r>
-        <w:t>IN: resume builder, three formats, fourteen designs, learning materials, export, two-resume design, all three accounts, matching, recommendations, audit trail, privacy features, light and dark mode, ISO 25010 evaluation.</w:t>
+        <w:t>IN: the builder with three formats and fourteen designs; learning materials; save, edit, export; the two-resume design; all three accounts; the matching feature; related-position recommendations; the audit trail; privacy features; light and dark mode; and the ISO/IEC 25010 evaluation.</w:t>
       </w:r>
     </w:p>
     <w:p>
@@ -1048,13 +1205,22 @@
         <w:spacing w:after="60"/>
       </w:pPr>
       <w:r>
-        <w:t>OUT: no machine learning in scoring, no external job boards, only one partner company, no hiring decision made by the system, recruitment stage only, no verification of what applicants type, no academic CV or Europass, no video resumes, no LinkedIn sign-in, no payment, no maintenance after the project, no native app.</w:t>
+        <w:t>Applicants track their application across TEN states, ending with withdrawn, which is the applicant's own.</w:t>
+      </w:r>
+    </w:p>
+    <w:p>
+      <w:pPr>
+        <w:pStyle w:val="ListBullet"/>
+        <w:spacing w:after="60"/>
+      </w:pPr>
+      <w:r>
+        <w:t>OUT: no machine learning in scoring; no external job boards; one partner company; no hiring decision made by the system; recruitment stage only; no verification of what applicants type; no academic CV or Europass; no video resumes; no LinkedIn sign-in; no payment; no maintenance after the project; no native app.</w:t>
       </w:r>
     </w:p>
     <w:p>
       <w:r>
         <w:rPr>
-          <w:b/>
+          <w:b w:val="0"/>
           <w:i w:val="0"/>
           <w:sz w:val="22"/>
         </w:rPr>
@@ -1076,7 +1242,7 @@
         <w:spacing w:after="60"/>
       </w:pPr>
       <w:r>
-        <w:t>The AI (Gemini) only extracts text into fields. It never scores.</w:t>
+        <w:t>The AI (Gemini) only extracts text into fields. It never scores, ranks or recommends.</w:t>
       </w:r>
     </w:p>
     <w:p>
@@ -1085,7 +1251,7 @@
         <w:spacing w:after="60"/>
       </w:pPr>
       <w:r>
-        <w:t>The system can now attach a proposed interview time to an invitation, but it does not manage availability, rescheduling or room booking.</w:t>
+        <w:t>The delimitation section carries the honest bits about the formula: two of three components measure QUANTITY not RELEVANCE, and field of study and recency are excluded on purpose, because a posting records a required LEVEL and has no field for a required COURSE. Scoring one would mean inventing a requirement the recruiter never set.</w:t>
       </w:r>
     </w:p>
     <w:p>
@@ -1100,7 +1266,7 @@
         <w:t xml:space="preserve">How to explain it to the panel: </w:t>
       </w:r>
       <w:r>
-        <w:t>"The system covers building a resume, matching it to openings, applying, and the recruiter side of screening. It stops at the recruitment stage. It makes no hiring decision and never auto-rejects. The scoring uses no machine learning at all."</w:t>
+        <w:t>"The system covers building a resume, matching it to openings, applying, and the recruiter side of screening. It stops at the recruitment stage. It makes no hiring decision and never auto-rejects, and the scoring uses no machine learning at all."</w:t>
       </w:r>
     </w:p>
     <w:p>
@@ -1130,12 +1296,42 @@
         <w:t xml:space="preserve">Simple answer: </w:t>
       </w:r>
       <w:r>
-        <w:t>"No. It is ATS-inspired. It uses the same idea, comparing a resume against stated requirements, but the formula is our own simple arithmetic, it is fully published, and unlike a real ATS it never rejects anyone."</w:t>
-      </w:r>
-    </w:p>
-    <w:p>
-      <w:pPr>
-        <w:pStyle w:val="Heading1"/>
+        <w:t>"No. It is ATS-inspired. It uses the same idea — comparing a resume against stated requirements — but the formula is our own arithmetic, it is fully published, and unlike a real ATS it never rejects anyone."</w:t>
+      </w:r>
+    </w:p>
+    <w:p>
+      <w:pPr>
+        <w:spacing w:after="60"/>
+      </w:pPr>
+      <w:r>
+        <w:rPr>
+          <w:b/>
+          <w:color w:val="16305C"/>
+        </w:rPr>
+        <w:t xml:space="preserve">Possible question: </w:t>
+      </w:r>
+      <w:r>
+        <w:t>Could an applicant just add the skills the posting asks for?</w:t>
+      </w:r>
+    </w:p>
+    <w:p>
+      <w:pPr>
+        <w:spacing w:after="60"/>
+      </w:pPr>
+      <w:r>
+        <w:rPr>
+          <w:b/>
+          <w:color w:val="16305C"/>
+        </w:rPr>
+        <w:t xml:space="preserve">Simple answer: </w:t>
+      </w:r>
+      <w:r>
+        <w:t>"They could, and the paper says so rather than hiding it. Three things bound it. A skill with no named source counts half, not whole, so on a four-skill posting an applicant who adds three unsourced reaches 81, not 100. The applicant is told how many skills are missing and of what kind, never which ones, so we do not hand over the wording to copy. And the uploaded file is forwarded to the recruiter, so a claim is something they can open and check."</w:t>
+      </w:r>
+    </w:p>
+    <w:p>
+      <w:pPr>
+        <w:pStyle w:val="Heading2"/>
       </w:pPr>
       <w:r>
         <w:t>Limitations of the Study</w:t>
@@ -1153,13 +1349,13 @@
         <w:t xml:space="preserve">What is this section about? </w:t>
       </w:r>
       <w:r>
-        <w:t>Constraints we did not choose and cannot remove. These bound what our findings mean.</w:t>
+        <w:t>Constraints we did not choose and cannot remove. These bound what the findings mean.</w:t>
       </w:r>
     </w:p>
     <w:p>
       <w:r>
         <w:rPr>
-          <w:b/>
+          <w:b w:val="0"/>
           <w:i w:val="0"/>
           <w:sz w:val="22"/>
         </w:rPr>
@@ -1181,7 +1377,7 @@
         <w:spacing w:after="60"/>
       </w:pPr>
       <w:r>
-        <w:t>We built the system and we also evaluate it. That is a bias.</w:t>
+        <w:t>We built the system and we also evaluate it.</w:t>
       </w:r>
     </w:p>
     <w:p>
@@ -1190,7 +1386,7 @@
         <w:spacing w:after="60"/>
       </w:pPr>
       <w:r>
-        <w:t>The HR group is about ten people, a census not a sample.</w:t>
+        <w:t>The HR group is a census of about ten, not a sample.</w:t>
       </w:r>
     </w:p>
     <w:p>
@@ -1199,7 +1395,7 @@
         <w:spacing w:after="60"/>
       </w:pPr>
       <w:r>
-        <w:t>One session of 20 to 30 minutes per respondent.</w:t>
+        <w:t>One session of twenty to thirty minutes; reliability over time cannot be established that way.</w:t>
       </w:r>
     </w:p>
     <w:p>
@@ -1208,7 +1404,7 @@
         <w:spacing w:after="60"/>
       </w:pPr>
       <w:r>
-        <w:t>All items are closed, so an unanticipated problem cannot be reported.</w:t>
+        <w:t>Every item is closed, so an unanticipated problem cannot be reported.</w:t>
       </w:r>
     </w:p>
     <w:p>
@@ -1217,7 +1413,7 @@
         <w:spacing w:after="60"/>
       </w:pPr>
       <w:r>
-        <w:t>The paired before-and-after is bounded at about 20 pairs, not the 40 planned.</w:t>
+        <w:t>The same respondents answered before and after, so post-use ratings come from sensitised respondents.</w:t>
       </w:r>
     </w:p>
     <w:p>
@@ -1226,7 +1422,7 @@
         <w:spacing w:after="60"/>
       </w:pPr>
       <w:r>
-        <w:t>Skill vocabulary covers 81.7 percent of skill terms.</w:t>
+        <w:t>The paired items carry every threat of a one-group pretest-posttest design, and the study can exclude none of them.</w:t>
       </w:r>
     </w:p>
     <w:p>
@@ -1235,7 +1431,7 @@
         <w:spacing w:after="60"/>
       </w:pPr>
       <w:r>
-        <w:t>Weights can differ per opening, so scores are not comparable between openings.</w:t>
+        <w:t>Two of three score components measure quantity, not relevance; the vocabulary covers 81.7% of skill terms.</w:t>
       </w:r>
     </w:p>
     <w:p>
@@ -1244,7 +1440,7 @@
         <w:spacing w:after="60"/>
       </w:pPr>
       <w:r>
-        <w:t>The ranking check uses 5 resumes and about 10 recruiters on 1 posting.</w:t>
+        <w:t>Weights differ per posting, so scores are not comparable between differently weighted openings.</w:t>
       </w:r>
     </w:p>
     <w:p>
@@ -1253,22 +1449,13 @@
         <w:spacing w:after="60"/>
       </w:pPr>
       <w:r>
-        <w:t>Never compared against a real commercial ATS.</w:t>
-      </w:r>
-    </w:p>
-    <w:p>
-      <w:pPr>
-        <w:pStyle w:val="ListBullet"/>
-        <w:spacing w:after="60"/>
-      </w:pPr>
-      <w:r>
-        <w:t>We measure system quality, not whether anyone got hired.</w:t>
+        <w:t>Never compared against a commercial ATS. Quality is measured, not employment outcomes.</w:t>
       </w:r>
     </w:p>
     <w:p>
       <w:r>
         <w:rPr>
-          <w:b/>
+          <w:b w:val="0"/>
           <w:i w:val="0"/>
           <w:sz w:val="22"/>
         </w:rPr>
@@ -1281,7 +1468,7 @@
         <w:spacing w:after="60"/>
       </w:pPr>
       <w:r>
-        <w:t>Say limitations confidently. They are a strength in a defence, not a weakness.</w:t>
+        <w:t>Say limitations confidently. In a defence they read as strength.</w:t>
       </w:r>
     </w:p>
     <w:p>
@@ -1290,7 +1477,16 @@
         <w:spacing w:after="60"/>
       </w:pPr>
       <w:r>
-        <w:t>The most important one to admit first: we built it and we evaluate it.</w:t>
+        <w:t>Volunteer the self-evaluation bias FIRST. It is the one the panel is going to raise anyway.</w:t>
+      </w:r>
+    </w:p>
+    <w:p>
+      <w:pPr>
+        <w:pStyle w:val="ListBullet"/>
+        <w:spacing w:after="60"/>
+      </w:pPr>
+      <w:r>
+        <w:t>The pretest-posttest paragraph is unusually candid and worth quoting: a respondent may simply have thought about the question more, or learned something between sittings, or answered the way they believed was wanted, and asking the same item twice is itself a prompt.</w:t>
       </w:r>
     </w:p>
     <w:p>
@@ -1305,7 +1501,7 @@
         <w:t xml:space="preserve">How to explain it to the panel: </w:t>
       </w:r>
       <w:r>
-        <w:t>"The biggest one is that we built the system and we are also the ones evaluating it. We put procedures in place to limit that, but we cannot remove it, and we say so in the paper. The second is that it is one company in one industry, so our findings describe this pilot, not Philippine recruitment generally."</w:t>
+        <w:t>"The biggest one is that we built the system and we are also the ones evaluating it. We put four procedures in place to limit that, but we cannot remove it, and we say so. The second is that it is one company in one industry, so our findings describe this pilot, not Philippine recruitment generally."</w:t>
       </w:r>
     </w:p>
     <w:p>
@@ -1335,15 +1531,48 @@
         <w:t xml:space="preserve">Simple answer: </w:t>
       </w:r>
       <w:r>
-        <w:t>"That we evaluate our own system. We limit it by keeping responses confidential, having no researcher present while people answer, telling respondents that critical ratings are as useful as positive ones, and publishing the interpretation scale before collecting any data. It limits the bias. It does not remove it."</w:t>
-      </w:r>
-    </w:p>
-    <w:p>
-      <w:pPr>
-        <w:pStyle w:val="Heading1"/>
-      </w:pPr>
-      <w:r>
-        <w:t>Definition of Terms</w:t>
+        <w:t>"That we evaluate our own system. We limit it by keeping responses confidential, having no researcher present while people answer, telling respondents that critical ratings are as useful as positive ones, and publishing the interpretation scale before collecting any data. That limits the bias. It does not remove it."</w:t>
+      </w:r>
+    </w:p>
+    <w:p>
+      <w:pPr>
+        <w:pStyle w:val="Heading2"/>
+      </w:pPr>
+      <w:r>
+        <w:t>Method — the chapter in one paragraph</w:t>
+      </w:r>
+    </w:p>
+    <w:p>
+      <w:r>
+        <w:rPr>
+          <w:b w:val="0"/>
+          <w:i w:val="0"/>
+          <w:sz w:val="22"/>
+        </w:rPr>
+        <w:t>Quantitative descriptive design. The job seeker strand additionally carries a one-group pretest-posttest structure (Campbell &amp; Stanley, 1963), which the paper correctly labels pre-experimental. The Method chapter holds eleven subsections, and the one panelists press hardest on is the sample.</w:t>
+      </w:r>
+    </w:p>
+    <w:p>
+      <w:pPr>
+        <w:spacing w:after="60"/>
+      </w:pPr>
+      <w:r>
+        <w:rPr>
+          <w:b/>
+          <w:color w:val="16305C"/>
+        </w:rPr>
+        <w:t xml:space="preserve">The sentence that separates building from researching: </w:t>
+      </w:r>
+      <w:r>
+        <w:t>"Building the software follows the Agile model; Agile governs how the system is built, not how the study investigates. The investigation itself uses the quantitative descriptive design." Learn that distinction — it is what stops an Agile question from turning into a research-design question.</w:t>
+      </w:r>
+    </w:p>
+    <w:p>
+      <w:pPr>
+        <w:pStyle w:val="Heading2"/>
+      </w:pPr>
+      <w:r>
+        <w:t>Design of Software, System, Product and Process (the Agile section)</w:t>
       </w:r>
     </w:p>
     <w:p>
@@ -1358,13 +1587,13 @@
         <w:t xml:space="preserve">What is this section about? </w:t>
       </w:r>
       <w:r>
-        <w:t>The important words in the paper, defined so everyone reads them the same way.</w:t>
+        <w:t>The software process model used to build the system.</w:t>
       </w:r>
     </w:p>
     <w:p>
       <w:r>
         <w:rPr>
-          <w:b/>
+          <w:b w:val="0"/>
           <w:i w:val="0"/>
           <w:sz w:val="22"/>
         </w:rPr>
@@ -1377,7 +1606,7 @@
         <w:spacing w:after="60"/>
       </w:pPr>
       <w:r>
-        <w:t>ATS: Applicant Tracking System, the software companies use to receive and screen resumes.</w:t>
+        <w:t>Agile, an iterative and incremental approach, cited to Pressman (2014).</w:t>
       </w:r>
     </w:p>
     <w:p>
@@ -1386,7 +1615,7 @@
         <w:spacing w:after="60"/>
       </w:pPr>
       <w:r>
-        <w:t>Compatibility score: our 0 to 100 number for how well a resume fits an opening.</w:t>
+        <w:t>Chosen because the features were complex enough that building and testing each before moving on produced a more reliable result than waiting until everything was written.</w:t>
       </w:r>
     </w:p>
     <w:p>
@@ -1395,7 +1624,7 @@
         <w:spacing w:after="60"/>
       </w:pPr>
       <w:r>
-        <w:t>Structured resume: the resume built inside our system, in fields, which is what gets scored.</w:t>
+        <w:t>Each cycle produced a working increment: builder first, then application management, then the matching engine.</w:t>
       </w:r>
     </w:p>
     <w:p>
@@ -1404,13 +1633,22 @@
         <w:spacing w:after="60"/>
       </w:pPr>
       <w:r>
-        <w:t>Parser-safe design: a single-column layout with no tables, text boxes or graphics, so software reads it correctly.</w:t>
+        <w:t>Five phases inside it: planning and requirements, system design, development, testing and QA, deployment.</w:t>
+      </w:r>
+    </w:p>
+    <w:p>
+      <w:pPr>
+        <w:pStyle w:val="ListBullet"/>
+        <w:spacing w:after="60"/>
+      </w:pPr>
+      <w:r>
+        <w:t>Figure 2 is captioned "Agile Model".</w:t>
       </w:r>
     </w:p>
     <w:p>
       <w:r>
         <w:rPr>
-          <w:b/>
+          <w:b w:val="0"/>
           <w:i w:val="0"/>
           <w:sz w:val="22"/>
         </w:rPr>
@@ -1423,7 +1661,16 @@
         <w:spacing w:after="60"/>
       </w:pPr>
       <w:r>
-        <w:t>Be able to define ATS, compatibility score and parser-safe in one sentence each.</w:t>
+        <w:t>The protective sentence, almost word for word: "By the time the evaluation instruments were administered, the system was complete and no further changes were made. Agile governed how the system was built, not how it was evaluated, and every respondent used the same finished system."</w:t>
+      </w:r>
+    </w:p>
+    <w:p>
+      <w:pPr>
+        <w:pStyle w:val="ListBullet"/>
+        <w:spacing w:after="60"/>
+      </w:pPr>
+      <w:r>
+        <w:t>Two supports: correctness was established by 232 automated tests before the evaluation, not by the evaluation; and the things most likely to need adjustment are configuration rows, not code.</w:t>
       </w:r>
     </w:p>
     <w:p>
@@ -1438,7 +1685,7 @@
         <w:t xml:space="preserve">How to explain it to the panel: </w:t>
       </w:r>
       <w:r>
-        <w:t>"The terms that matter most are ATS, which is the screening software companies use; the compatibility score, which is our 0 to 100 measure of fit; and parser-safe, which means a layout simple enough for software to read correctly."</w:t>
+        <w:t>"We used Agile because the system had several substantial features and building and testing each one before moving to the next produced a more reliable result. But development finished before evaluation began. Every respondent rated the same completed system."</w:t>
       </w:r>
     </w:p>
     <w:p>
@@ -1453,7 +1700,7 @@
         <w:t xml:space="preserve">Possible question: </w:t>
       </w:r>
       <w:r>
-        <w:t>What does parser-safe mean?</w:t>
+        <w:t>If you used Agile, did different respondents rate different versions of the system?</w:t>
       </w:r>
     </w:p>
     <w:p>
@@ -1468,28 +1715,45 @@
         <w:t xml:space="preserve">Simple answer: </w:t>
       </w:r>
       <w:r>
-        <w:t>"It means the resume is one column, with no tables, no text boxes, no columns and no pictures. Those are the things that make screening software read a resume wrongly."</w:t>
-      </w:r>
-    </w:p>
-    <w:p>
-      <w:r>
-        <w:br w:type="page"/>
-      </w:r>
-    </w:p>
-    <w:p>
-      <w:pPr>
-        <w:pStyle w:val="Heading1"/>
-      </w:pPr>
-      <w:r>
-        <w:t>CHAPTER 3 SECTIONS (METHOD)</w:t>
-      </w:r>
-    </w:p>
-    <w:p>
-      <w:pPr>
-        <w:pStyle w:val="Heading1"/>
-      </w:pPr>
-      <w:r>
-        <w:t>Research Method / Design</w:t>
+        <w:t>"No. Agile describes how we built it, not how we evaluated it. Development was complete and frozen before the first evaluation instrument went out, and every respondent used the same finished system. The only things that could change afterwards are configuration values like the weights, and changing a setting is not a change of design."</w:t>
+      </w:r>
+    </w:p>
+    <w:p>
+      <w:pPr>
+        <w:spacing w:after="60"/>
+      </w:pPr>
+      <w:r>
+        <w:rPr>
+          <w:b/>
+          <w:color w:val="16305C"/>
+        </w:rPr>
+        <w:t xml:space="preserve">Possible question: </w:t>
+      </w:r>
+      <w:r>
+        <w:t>Why not Waterfall, given the evaluation happens once at the end?</w:t>
+      </w:r>
+    </w:p>
+    <w:p>
+      <w:pPr>
+        <w:spacing w:after="60"/>
+      </w:pPr>
+      <w:r>
+        <w:rPr>
+          <w:b/>
+          <w:color w:val="16305C"/>
+        </w:rPr>
+        <w:t xml:space="preserve">Simple answer: </w:t>
+      </w:r>
+      <w:r>
+        <w:t>"Because the evaluation being one-shot does not require the construction to be one-shot. We needed to test the builder before the matching engine depended on it. What the evaluation requires is that the system stops changing before respondents see it, and it did."</w:t>
+      </w:r>
+    </w:p>
+    <w:p>
+      <w:pPr>
+        <w:pStyle w:val="Heading2"/>
+      </w:pPr>
+      <w:r>
+        <w:t>Sample and Setting</w:t>
       </w:r>
     </w:p>
     <w:p>
@@ -1504,13 +1768,13 @@
         <w:t xml:space="preserve">What is this section about? </w:t>
       </w:r>
       <w:r>
-        <w:t>How we carried out the study.</w:t>
+        <w:t>Who answers, how they were chosen, and how many there actually were.</w:t>
       </w:r>
     </w:p>
     <w:p>
       <w:r>
         <w:rPr>
-          <w:b/>
+          <w:b w:val="0"/>
           <w:i w:val="0"/>
           <w:sz w:val="22"/>
         </w:rPr>
@@ -1523,7 +1787,7 @@
         <w:spacing w:after="60"/>
       </w:pPr>
       <w:r>
-        <w:t>Quantitative descriptive design.</w:t>
+        <w:t>Setting: Holy Angel University, Angeles City, and Clark Outsourcing, Clark Freeport Zone.</w:t>
       </w:r>
     </w:p>
     <w:p>
@@ -1532,7 +1796,7 @@
         <w:spacing w:after="60"/>
       </w:pPr>
       <w:r>
-        <w:t>Data comes from closed questions: multiple choice, checklists, and a five-point agreement scale. (An earlier plan included a ranking task; it was never administered and is not part of the final instrument set.)</w:t>
+        <w:t>Three groups: job seekers, HR personnel, IT experts. Sampling is PURPOSIVE.</w:t>
       </w:r>
     </w:p>
     <w:p>
@@ -1541,13 +1805,40 @@
         <w:spacing w:after="60"/>
       </w:pPr>
       <w:r>
-        <w:t>Phases: requirement analysis, design, development, testing, evaluation.</w:t>
+        <w:t>Job seeker target was 40 — a practical minimum for a single-site study, not a power calculation.</w:t>
+      </w:r>
+    </w:p>
+    <w:p>
+      <w:pPr>
+        <w:pStyle w:val="ListBullet"/>
+        <w:spacing w:after="60"/>
+      </w:pPr>
+      <w:r>
+        <w:t>Instrument A drew 108 responses, 103 valid. 46 are in the target population; the other 57 are "currently employed and not looking" and are reported separately, never pooled.</w:t>
+      </w:r>
+    </w:p>
+    <w:p>
+      <w:pPr>
+        <w:pStyle w:val="ListBullet"/>
+        <w:spacing w:after="60"/>
+      </w:pPr>
+      <w:r>
+        <w:t>HR: a purposive census of one department. IT experts: five sought, three the stated minimum.</w:t>
+      </w:r>
+    </w:p>
+    <w:p>
+      <w:pPr>
+        <w:pStyle w:val="ListBullet"/>
+        <w:spacing w:after="60"/>
+      </w:pPr>
+      <w:r>
+        <w:t>IT expert criteria are three conditions, ALL of which must hold: at least three years professional experience; has worked with web applications; and took no part in developing the system.</w:t>
       </w:r>
     </w:p>
     <w:p>
       <w:r>
         <w:rPr>
-          <w:b/>
+          <w:b w:val="0"/>
           <w:i w:val="0"/>
           <w:sz w:val="22"/>
         </w:rPr>
@@ -1560,7 +1851,7 @@
         <w:spacing w:after="60"/>
       </w:pPr>
       <w:r>
-        <w:t>The words to remember: QUANTITATIVE DESCRIPTIVE.</w:t>
+        <w:t>PURPOSIVE, not random. No Slovin formula, and the paper explains why in full.</w:t>
       </w:r>
     </w:p>
     <w:p>
@@ -1569,7 +1860,16 @@
         <w:spacing w:after="60"/>
       </w:pPr>
       <w:r>
-        <w:t>Descriptive means we describe what these respondents said. We do not claim it applies to all Filipinos.</w:t>
+        <w:t>Why the 57 are reported and not discarded: they answered the same instrument at the same time and their answers differ systematically, which is itself a finding about who feels these difficulties. Pooling them would produce a mean describing neither group and would understate every difficulty the study is about.</w:t>
+      </w:r>
+    </w:p>
+    <w:p>
+      <w:pPr>
+        <w:pStyle w:val="ListBullet"/>
+        <w:spacing w:after="60"/>
+      </w:pPr>
+      <w:r>
+        <w:t>The 20-pair ceiling: 29 of 103 supplied the optional linking email, and only 20 of those are inside the 46. So the paired comparison the study planned was capped at 20 against a planned 40.</w:t>
       </w:r>
     </w:p>
     <w:p>
@@ -1584,7 +1884,7 @@
         <w:t xml:space="preserve">How to explain it to the panel: </w:t>
       </w:r>
       <w:r>
-        <w:t>"It is quantitative descriptive. Our questions are about how widely a difficulty is shared and how a defined group rates the system against defined criteria. Those are answered by counting and averaging closed answers, which is exactly what a descriptive design does."</w:t>
+        <w:t>"We used purposive sampling with three groups. Job seekers and HR match the two public account types. IT experts judge security and maintainability, which ordinary users are not placed to judge. The HR group is a census of a small department, not a sample."</w:t>
       </w:r>
     </w:p>
     <w:p>
@@ -1599,7 +1899,7 @@
         <w:t xml:space="preserve">Possible question: </w:t>
       </w:r>
       <w:r>
-        <w:t>Why not experimental?</w:t>
+        <w:t>Why did you not use Slovin's formula?</w:t>
       </w:r>
     </w:p>
     <w:p>
@@ -1614,15 +1914,45 @@
         <w:t xml:space="preserve">Simple answer: </w:t>
       </w:r>
       <w:r>
-        <w:t>"Because we are not testing a cause. We are describing how two groups rate a process and a system. We have no control group and we make no causal claim."</w:t>
-      </w:r>
-    </w:p>
-    <w:p>
-      <w:pPr>
-        <w:pStyle w:val="Heading1"/>
-      </w:pPr>
-      <w:r>
-        <w:t>Development Method</w:t>
+        <w:t>"Because Slovin bounds the error of an estimate obtained by random probability sampling, and the margin of error it produces is a property of random selection. Our sampling is purposive and there is no enumerated list of all Filipino job seekers to draw randomly from, so a margin of error computed over a purposively chosen group would carry no inferential meaning."</w:t>
+      </w:r>
+    </w:p>
+    <w:p>
+      <w:pPr>
+        <w:spacing w:after="60"/>
+      </w:pPr>
+      <w:r>
+        <w:rPr>
+          <w:b/>
+          <w:color w:val="16305C"/>
+        </w:rPr>
+        <w:t xml:space="preserve">Possible question: </w:t>
+      </w:r>
+      <w:r>
+        <w:t>You aimed for five IT experts and got three. Is that enough?</w:t>
+      </w:r>
+    </w:p>
+    <w:p>
+      <w:pPr>
+        <w:spacing w:after="60"/>
+      </w:pPr>
+      <w:r>
+        <w:rPr>
+          <w:b/>
+          <w:color w:val="16305C"/>
+        </w:rPr>
+        <w:t xml:space="preserve">Simple answer: </w:t>
+      </w:r>
+      <w:r>
+        <w:t>"Three is the minimum we declared in advance, below which we said we would report the evaluation as incomplete rather than as a result. We reached it, so we report it — but we report it as a set of judgements from named kinds of expertise, not as a mean over a sample, and the paper says three respondents support no inference beyond themselves."</w:t>
+      </w:r>
+    </w:p>
+    <w:p>
+      <w:pPr>
+        <w:pStyle w:val="Heading2"/>
+      </w:pPr>
+      <w:r>
+        <w:t>Instrument / Simulation Tool</w:t>
       </w:r>
     </w:p>
     <w:p>
@@ -1637,13 +1967,13 @@
         <w:t xml:space="preserve">What is this section about? </w:t>
       </w:r>
       <w:r>
-        <w:t>The software process model we used to build the system.</w:t>
+        <w:t>The five questionnaires, what is in each, and which ISO characteristics they cover.</w:t>
       </w:r>
     </w:p>
     <w:p>
       <w:r>
         <w:rPr>
-          <w:b/>
+          <w:b w:val="0"/>
           <w:i w:val="0"/>
           <w:sz w:val="22"/>
         </w:rPr>
@@ -1656,7 +1986,7 @@
         <w:spacing w:after="60"/>
       </w:pPr>
       <w:r>
-        <w:t>Waterfall, also called the linear sequential model, from Pressman (2014).</w:t>
+        <w:t>A: 21 items plus consent. B: 22 items. C: 40 items. D: 28 items. E: 31 items.</w:t>
       </w:r>
     </w:p>
     <w:p>
@@ -1665,7 +1995,7 @@
         <w:spacing w:after="60"/>
       </w:pPr>
       <w:r>
-        <w:t>Five phases: planning and requirements, system design, development, testing, evaluation.</w:t>
+        <w:t>C contains 17 rated ISO items, the 10-item System Usability Scale, and the 4 repeated items.</w:t>
       </w:r>
     </w:p>
     <w:p>
@@ -1674,13 +2004,40 @@
         <w:spacing w:after="60"/>
       </w:pPr>
       <w:r>
-        <w:t>It runs one direction. There is no loop back from evaluation to design.</w:t>
+        <w:t>D contains 14 rated ISO items plus an ordering group reported as a distribution.</w:t>
+      </w:r>
+    </w:p>
+    <w:p>
+      <w:pPr>
+        <w:pStyle w:val="ListBullet"/>
+        <w:spacing w:after="60"/>
+      </w:pPr>
+      <w:r>
+        <w:t>E contains 27 rated items across all five characteristics plus 4 background items.</w:t>
+      </w:r>
+    </w:p>
+    <w:p>
+      <w:pPr>
+        <w:pStyle w:val="ListBullet"/>
+        <w:spacing w:after="60"/>
+      </w:pPr>
+      <w:r>
+        <w:t>All researcher-made and entirely closed, except the SUS, which is reproduced without alteration.</w:t>
+      </w:r>
+    </w:p>
+    <w:p>
+      <w:pPr>
+        <w:pStyle w:val="ListBullet"/>
+        <w:spacing w:after="60"/>
+      </w:pPr>
+      <w:r>
+        <w:t>Two kinds of item are EXCLUDED from the quality means: items describing the respondent, and items worded so that agreement is not a good outcome. Appendix A marks every one.</w:t>
       </w:r>
     </w:p>
     <w:p>
       <w:r>
         <w:rPr>
-          <w:b/>
+          <w:b w:val="0"/>
           <w:i w:val="0"/>
           <w:sz w:val="22"/>
         </w:rPr>
@@ -1693,7 +2050,7 @@
         <w:spacing w:after="60"/>
       </w:pPr>
       <w:r>
-        <w:t>Name to remember: Waterfall, Pressman 2014.</w:t>
+        <w:t>The SUS is included for exactly one reason: everything else we produce comes from a researcher-made instrument and therefore cannot be compared to anything outside this paper. The SUS has published norms.</w:t>
       </w:r>
     </w:p>
     <w:p>
@@ -1702,7 +2059,16 @@
         <w:spacing w:after="60"/>
       </w:pPr>
       <w:r>
-        <w:t>The honest cost: a fault the evaluation reveals cannot be fixed and re-rated inside this study, because a repaired system is no longer the system earlier respondents rated.</w:t>
+        <w:t>The reliability caveat is built into the design, not bolted on: reliability items ask respondents to rate what they encountered during their own use, and results are reported as "reliability as experienced within a single session".</w:t>
+      </w:r>
+    </w:p>
+    <w:p>
+      <w:pPr>
+        <w:pStyle w:val="ListBullet"/>
+        <w:spacing w:after="60"/>
+      </w:pPr>
+      <w:r>
+        <w:t>Excluded ISO characteristics and why: performance efficiency (shared hosting measures the hosting tier, not our design), compatibility (no external system exchange), portability (web app, no install).</w:t>
       </w:r>
     </w:p>
     <w:p>
@@ -1717,7 +2083,7 @@
         <w:t xml:space="preserve">How to explain it to the panel: </w:t>
       </w:r>
       <w:r>
-        <w:t>"We used Waterfall because the evaluation is a research instrument, not a development activity. It needs a finished system, it needs the SAME finished system for every respondent, and it happens once. An iterative model that changes the system between respondents would mean people rated different systems."</w:t>
+        <w:t>"We have five researcher-made instruments, all closed items. Two are administered before the system exists, to describe the problem. Three are administered after use, to evaluate the system against ISO 25010. The only published instrument inside them is the System Usability Scale."</w:t>
       </w:r>
     </w:p>
     <w:p>
@@ -1732,7 +2098,7 @@
         <w:t xml:space="preserve">Possible question: </w:t>
       </w:r>
       <w:r>
-        <w:t>Why Waterfall and not Agile?</w:t>
+        <w:t>Why did you exclude three of the eight ISO 25010 characteristics?</w:t>
       </w:r>
     </w:p>
     <w:p>
@@ -1747,15 +2113,15 @@
         <w:t xml:space="preserve">Simple answer: </w:t>
       </w:r>
       <w:r>
-        <w:t>"Because every respondent has to rate the same system. If we kept changing it between respondents, their ratings could not be combined. We state the cost of that choice in the paper."</w:t>
-      </w:r>
-    </w:p>
-    <w:p>
-      <w:pPr>
-        <w:pStyle w:val="Heading1"/>
-      </w:pPr>
-      <w:r>
-        <w:t>Participants / Respondents and Sampling</w:t>
+        <w:t>"Performance efficiency because we are on shared hosting, so response times measure the hosting tier and not our design. Compatibility because the system exchanges data with no external system. Portability because it is a web application with no separate install."</w:t>
+      </w:r>
+    </w:p>
+    <w:p>
+      <w:pPr>
+        <w:pStyle w:val="Heading2"/>
+      </w:pPr>
+      <w:r>
+        <w:t>Data Analysis</w:t>
       </w:r>
     </w:p>
     <w:p>
@@ -1770,13 +2136,13 @@
         <w:t xml:space="preserve">What is this section about? </w:t>
       </w:r>
       <w:r>
-        <w:t>Who answers our questions, and how they were chosen.</w:t>
+        <w:t>What we do with the numbers.</w:t>
       </w:r>
     </w:p>
     <w:p>
       <w:r>
         <w:rPr>
-          <w:b/>
+          <w:b w:val="0"/>
           <w:i w:val="0"/>
           <w:sz w:val="22"/>
         </w:rPr>
@@ -1789,7 +2155,7 @@
         <w:spacing w:after="60"/>
       </w:pPr>
       <w:r>
-        <w:t>Three groups: job seekers, HR personnel, and IT experts.</w:t>
+        <w:t>Descriptive statistics throughout: frequency distributions and weighted means with the SAMPLE standard deviation, computed with n-1.</w:t>
       </w:r>
     </w:p>
     <w:p>
@@ -1798,7 +2164,7 @@
         <w:spacing w:after="60"/>
       </w:pPr>
       <w:r>
-        <w:t>Target: 40 job seekers who complete BOTH instruments; about 10 HR (a census of the department); plus IT experts.</w:t>
+        <w:t>One inferential test, on the four repeated items only: a Wilcoxon test, applied two-sided because the direction was not predicted in advance.</w:t>
       </w:r>
     </w:p>
     <w:p>
@@ -1807,7 +2173,7 @@
         <w:spacing w:after="60"/>
       </w:pPr>
       <w:r>
-        <w:t>Sampling is PURPOSIVE, not random.</w:t>
+        <w:t>Signed-rank where enough respondents supply the linking email; rank-sum (Mann-Whitney U) where they do not. Both are genuine forms of the same test, and which one was used is stated at each result.</w:t>
       </w:r>
     </w:p>
     <w:p>
@@ -1816,7 +2182,7 @@
         <w:spacing w:after="60"/>
       </w:pPr>
       <w:r>
-        <w:t>IT expert criteria: at least three years of professional experience in software development, systems administration, or teaching IT.</w:t>
+        <w:t>The SUS is scored by its own published procedure and never folded into an ISO mean.</w:t>
       </w:r>
     </w:p>
     <w:p>
@@ -1825,13 +2191,13 @@
         <w:spacing w:after="60"/>
       </w:pPr>
       <w:r>
-        <w:t>Setting: Holy Angel University, Angeles City, and Clark Outsourcing, Clark Freeport Zone.</w:t>
+        <w:t>Seven analysis steps, ending with all three researchers independently computing one instrument's means and comparing before the full analysis proceeded.</w:t>
       </w:r>
     </w:p>
     <w:p>
       <w:r>
         <w:rPr>
-          <w:b/>
+          <w:b w:val="0"/>
           <w:i w:val="0"/>
           <w:sz w:val="22"/>
         </w:rPr>
@@ -1844,7 +2210,7 @@
         <w:spacing w:after="60"/>
       </w:pPr>
       <w:r>
-        <w:t>PURPOSIVE sampling. We chose people who meet criteria, not at random.</w:t>
+        <w:t>The interpretation scale was FIXED IN ADVANCE: 4.50-5.00 excellent, 3.50-4.49 good, 2.50-3.49 fair, 1.50-2.49 poor, 1.00-1.49 very poor. That is Table 2.</w:t>
       </w:r>
     </w:p>
     <w:p>
@@ -1853,7 +2219,7 @@
         <w:spacing w:after="60"/>
       </w:pPr>
       <w:r>
-        <w:t>No Slovin formula, and we explain why: Slovin bounds error for RANDOM sampling. We have no sampling frame and did not sample randomly, so a margin of error would mean nothing.</w:t>
+        <w:t>It is NOT applied to items worded so agreement reports a difficulty, nor to the SUS.</w:t>
       </w:r>
     </w:p>
     <w:p>
@@ -1862,7 +2228,16 @@
         <w:spacing w:after="60"/>
       </w:pPr>
       <w:r>
-        <w:t>The administrator account has no respondent group because the research team runs it.</w:t>
+        <w:t>User means and expert means are NEVER pooled — one group rated what it used, the other rated what it inspected.</w:t>
+      </w:r>
+    </w:p>
+    <w:p>
+      <w:pPr>
+        <w:pStyle w:val="ListBullet"/>
+        <w:spacing w:after="60"/>
+      </w:pPr>
+      <w:r>
+        <w:t>Computation was in a spreadsheet, with formulas retained beside the data so any figure can be traced back.</w:t>
       </w:r>
     </w:p>
     <w:p>
@@ -1877,7 +2252,7 @@
         <w:t xml:space="preserve">How to explain it to the panel: </w:t>
       </w:r>
       <w:r>
-        <w:t>"We use purposive sampling with three groups. Job seekers and HR match the two public account types. IT experts judge security and maintainability, which ordinary users are not placed to judge. The HR group is a census of a small department, about ten people, not a sample."</w:t>
+        <w:t>"Nearly all of it is descriptive: counts, percentages, and weighted means with standard deviations. The one inferential test is a Wilcoxon test on the four items asked before and after use."</w:t>
       </w:r>
     </w:p>
     <w:p>
@@ -1892,7 +2267,7 @@
         <w:t xml:space="preserve">Possible question: </w:t>
       </w:r>
       <w:r>
-        <w:t>Why did you not use Slovin's formula?</w:t>
+        <w:t>Why Wilcoxon and not a t-test?</w:t>
       </w:r>
     </w:p>
     <w:p>
@@ -1907,21 +2282,37 @@
         <w:t xml:space="preserve">Simple answer: </w:t>
       </w:r>
       <w:r>
-        <w:t>"Because Slovin bounds the error of an estimate from RANDOM sampling. Our sampling is purposive and there is no list of all Filipino job seekers to draw randomly from. A margin of error computed on a purposively chosen group would carry no meaning."</w:t>
-      </w:r>
-    </w:p>
-    <w:p>
-      <w:pPr>
-        <w:pStyle w:val="Heading1"/>
-      </w:pPr>
-      <w:r>
-        <w:t>Research Instruments</w:t>
-      </w:r>
-    </w:p>
-    <w:p>
-      <w:pPr/>
-      <w:r>
-        <w:t>What is this section about? The questionnaires we use. There are FIVE now, not six — one, a ranking-agreement check, was withdrawn (see the mismatches section near the end of this document). All five are made by us except the ten System Usability Scale items inside Instrument C, which are a published instrument reproduced without change.</w:t>
+        <w:t>"Because our data is ordinal — a five-point agreement scale — and Wilcoxon is the appropriate test for ordinal data whether paired or independent. It also assumes no particular distribution, which a t-test does."</w:t>
+      </w:r>
+    </w:p>
+    <w:p>
+      <w:pPr>
+        <w:spacing w:after="60"/>
+      </w:pPr>
+      <w:r>
+        <w:rPr>
+          <w:b/>
+          <w:color w:val="16305C"/>
+        </w:rPr>
+        <w:t xml:space="preserve">Possible question: </w:t>
+      </w:r>
+      <w:r>
+        <w:t>Your comparison is unpaired. Why, when you designed it as paired?</w:t>
+      </w:r>
+    </w:p>
+    <w:p>
+      <w:pPr>
+        <w:spacing w:after="60"/>
+      </w:pPr>
+      <w:r>
+        <w:rPr>
+          <w:b/>
+          <w:color w:val="16305C"/>
+        </w:rPr>
+        <w:t xml:space="preserve">Simple answer: </w:t>
+      </w:r>
+      <w:r>
+        <w:t>"The linking field was an optional email address. Twenty-nine of 103 supplied one, and only twenty of those are inside our target 46 — against a planned forty. Rather than report a paired test on twenty or leave the comparison unmade, we report the rank-sum form between the two groups. It is a genuine result and a slightly less powerful test, and collecting a respondent-generated linking code is the first thing we recommend for future research."</w:t>
       </w:r>
     </w:p>
     <w:p>
@@ -1929,95 +2320,7 @@
         <w:pStyle w:val="Heading2"/>
       </w:pPr>
       <w:r>
-        <w:t>Key points</w:t>
-      </w:r>
-    </w:p>
-    <w:p>
-      <w:pPr/>
-      <w:r>
-        <w:t>Instrument A: Job Seeker Survey Part 1, before the system.</w:t>
-      </w:r>
-    </w:p>
-    <w:p>
-      <w:pPr/>
-      <w:r>
-        <w:t>Instrument B: HR Survey Part 1, before the system.</w:t>
-      </w:r>
-    </w:p>
-    <w:p>
-      <w:pPr/>
-      <w:r>
-        <w:t>Instrument C: Job Seeker Survey Part 2, after use. Includes four items repeated from Instrument A and the ten-item System Usability Scale.</w:t>
-      </w:r>
-    </w:p>
-    <w:p>
-      <w:pPr/>
-      <w:r>
-        <w:t>Instrument D: HR Survey Part 2, after use.</w:t>
-      </w:r>
-    </w:p>
-    <w:p>
-      <w:pPr/>
-      <w:r>
-        <w:t>Instrument E: IT Expert Evaluation, 31 items, the only one covering security and maintainability, and the only one administered to people who are not users of the system in the ordinary sense.</w:t>
-      </w:r>
-    </w:p>
-    <w:p>
-      <w:pPr>
-        <w:pStyle w:val="Heading2"/>
-      </w:pPr>
-      <w:r>
-        <w:t>What should I remember?</w:t>
-      </w:r>
-    </w:p>
-    <w:p>
-      <w:pPr/>
-      <w:r>
-        <w:t>Five instruments now, lettered A to E with no gap. A and B before the system exists; C, D and E after. If you hear "Instrument F" or "six instruments" from an older conversation or an old printout, that's stale — the IT expert instrument used to be F and was relettered to E when the ranking-agreement instrument (the old E) was withdrawn.</w:t>
-      </w:r>
-    </w:p>
-    <w:p>
-      <w:pPr/>
-      <w:r>
-        <w:t>Four items in C repeat items 10 to 13 of A. That is the before-and-after block. It is compared as a paired test where enough respondents supply a linking email address across both surveys, and as an unpaired test between the two groups where they don't — both are real forms of the same statistical test. In this study's actual data, none of Instrument C's respondents supplied a linking address, so that comparison is unpaired.</w:t>
-      </w:r>
-    </w:p>
-    <w:p>
-      <w:pPr/>
-      <w:r>
-        <w:t>The System Usability Scale is the ONLY published instrument we use. We include it because it has published norms, so our score can be compared to something outside our own paper. Benchmark is about 68. Our result: 74.7.</w:t>
-      </w:r>
-    </w:p>
-    <w:p>
-      <w:pPr/>
-      <w:r>
-        <w:t>ISO 25010 characteristics we evaluate: functional suitability, usability, reliability for users, plus security and maintainability for IT experts. We exclude performance efficiency, compatibility and portability, and say why in the paper.</w:t>
-      </w:r>
-    </w:p>
-    <w:p>
-      <w:pPr/>
-      <w:r>
-        <w:t>How to explain it to the panel: "We have five researcher-made instruments, all closed items except an optional written comment box. Two are administered before the system exists, to describe the problem. Three are administered after use, to evaluate the system against ISO 25010."</w:t>
-      </w:r>
-    </w:p>
-    <w:p>
-      <w:pPr/>
-      <w:r>
-        <w:t>Possible question: Why did you exclude some ISO 25010 characteristics?</w:t>
-      </w:r>
-    </w:p>
-    <w:p>
-      <w:pPr/>
-      <w:r>
-        <w:t>Simple answer: "Performance efficiency because we are on shared hosting, so response times measure the hosting tier and not our design. Compatibility because the system exchanges data with no external system. Portability because it is a web application with no separate install."</w:t>
-      </w:r>
-    </w:p>
-    <w:p>
-      <w:pPr>
-        <w:pStyle w:val="Heading1"/>
-      </w:pPr>
-      <w:r>
-        <w:t>Data Gathering Procedure</w:t>
+        <w:t>Validity and Reliability of the Instrument</w:t>
       </w:r>
     </w:p>
     <w:p>
@@ -2032,13 +2335,13 @@
         <w:t xml:space="preserve">What is this section about? </w:t>
       </w:r>
       <w:r>
-        <w:t>How we collect the answers.</w:t>
+        <w:t>How we make sure the questionnaires measure what they claim to.</w:t>
       </w:r>
     </w:p>
     <w:p>
       <w:r>
         <w:rPr>
-          <w:b/>
+          <w:b w:val="0"/>
           <w:i w:val="0"/>
           <w:sz w:val="22"/>
         </w:rPr>
@@ -2051,7 +2354,7 @@
         <w:spacing w:after="60"/>
       </w:pPr>
       <w:r>
-        <w:t>Written permission from Clark Outsourcing HR, and approval from the School of Computing, before any data.</w:t>
+        <w:t>Content validity by adviser review, item by item, against the research question or ISO characteristic it was written for; items judged not essential were reworded or removed (Lawshe, 1975).</w:t>
       </w:r>
     </w:p>
     <w:p>
@@ -2060,7 +2363,7 @@
         <w:spacing w:after="60"/>
       </w:pPr>
       <w:r>
-        <w:t>Consent shown at the start of every form, before any question.</w:t>
+        <w:t>Pilot test with three to five people outside the sample.</w:t>
       </w:r>
     </w:p>
     <w:p>
@@ -2069,7 +2372,7 @@
         <w:spacing w:after="60"/>
       </w:pPr>
       <w:r>
-        <w:t>Respondents are recruited through channels, never approached face to face by a researcher.</w:t>
+        <w:t>Internal consistency: Cronbach's alpha per characteristic, reported as it stands, with values below 0.70 shown rather than omitted.</w:t>
       </w:r>
     </w:p>
     <w:p>
@@ -2078,7 +2381,7 @@
         <w:spacing w:after="60"/>
       </w:pPr>
       <w:r>
-        <w:t>The two BEFORE instruments go out while the system is still being built, so answers are not a reaction to it.</w:t>
+        <w:t>An explicit acknowledgement that the design is deliberately paired, so post-use ratings are not independent of the pre-use ones — respondents are "informed rather than naive users".</w:t>
       </w:r>
     </w:p>
     <w:p>
@@ -2087,31 +2390,13 @@
         <w:spacing w:after="60"/>
       </w:pPr>
       <w:r>
-        <w:t>HR are NOT shown our scoring weights before they answer, so their own weighting is genuinely theirs.</w:t>
-      </w:r>
-    </w:p>
-    <w:p>
-      <w:pPr>
-        <w:pStyle w:val="ListBullet"/>
-        <w:spacing w:after="60"/>
-      </w:pPr>
-      <w:r>
-        <w:t>For the AFTER instruments each respondent gets a task sheet and works alone. No researcher sits beside them.</w:t>
-      </w:r>
-    </w:p>
-    <w:p>
-      <w:pPr>
-        <w:pStyle w:val="ListBullet"/>
-        <w:spacing w:after="60"/>
-      </w:pPr>
-      <w:r>
-        <w:t>IT experts get the deployed system, two accounts, and read access to the source code and schema.</w:t>
+        <w:t>An audit trail: the instruments, the raw exports, the analysis spreadsheet with its formulas, and the record of every exclusion. Available to the panel on request.</w:t>
       </w:r>
     </w:p>
     <w:p>
       <w:r>
         <w:rPr>
-          <w:b/>
+          <w:b w:val="0"/>
           <w:i w:val="0"/>
           <w:sz w:val="22"/>
         </w:rPr>
@@ -2124,7 +2409,7 @@
         <w:spacing w:after="60"/>
       </w:pPr>
       <w:r>
-        <w:t>Delivered through Google Forms.</w:t>
+        <w:t>Two names: Lawshe 1975 for content validity, Cronbach 1951 for internal consistency.</w:t>
       </w:r>
     </w:p>
     <w:p>
@@ -2133,7 +2418,7 @@
         <w:spacing w:after="60"/>
       </w:pPr>
       <w:r>
-        <w:t>Responses are CONFIDENTIAL, not anonymous — and we say so. The plan was an anonymous code; the form as built asks for an optional email instead. We record that as a departure from the plan.</w:t>
+        <w:t>The commitment that protects you: alpha is reported as it comes out, together with the items that pulled it down. Dropping an item because it lowered alpha, without saying so, would make the reported figure describe an instrument that was never administered.</w:t>
       </w:r>
     </w:p>
     <w:p>
@@ -2142,7 +2427,7 @@
         <w:spacing w:after="60"/>
       </w:pPr>
       <w:r>
-        <w:t>If a respondent cannot finish a task, that is RECORDED as a finding, not treated as missing data.</w:t>
+        <w:t>The audit trail line is worth volunteering. Offering to show the panel your working reads as confidence.</w:t>
       </w:r>
     </w:p>
     <w:p>
@@ -2157,7 +2442,7 @@
         <w:t xml:space="preserve">How to explain it to the panel: </w:t>
       </w:r>
       <w:r>
-        <w:t>"We get permission first, then consent inside the form. The before-instruments go out while the system is still in development, so answers describe their real experience. For the after-instruments, respondents work through a task sheet alone, with no researcher beside them."</w:t>
+        <w:t>"Three things. Our adviser checked every item against what it is supposed to measure, following Lawshe. We piloted with three to five people outside the sample. And we computed Cronbach's alpha per characteristic once the responses were in, and reported it as it came out."</w:t>
       </w:r>
     </w:p>
     <w:p>
@@ -2172,7 +2457,7 @@
         <w:t xml:space="preserve">Possible question: </w:t>
       </w:r>
       <w:r>
-        <w:t>Why not show HR your weights before they answer?</w:t>
+        <w:t>Two of your alpha values are low. Doesn't that invalidate those results?</w:t>
       </w:r>
     </w:p>
     <w:p>
@@ -2187,21 +2472,7 @@
         <w:t xml:space="preserve">Simple answer: </w:t>
       </w:r>
       <w:r>
-        <w:t>"Because we want their own weighting, not ours repeated back to us. If we showed them 50/25/25 first, their answer would be influenced by our design instead of describing how they actually screen."</w:t>
-      </w:r>
-    </w:p>
-    <w:p>
-      <w:pPr>
-        <w:pStyle w:val="Heading1"/>
-      </w:pPr>
-      <w:r>
-        <w:t>Data Analysis</w:t>
-      </w:r>
-    </w:p>
-    <w:p>
-      <w:pPr/>
-      <w:r>
-        <w:t>What is this section about? What we do with the numbers.</w:t>
+        <w:t>"It qualifies them and we report them rather than hide them. Instrument D's functional suitability is 0.52, and the reason is narrow variance rather than items disagreeing — ten respondents agreed too closely for alpha to have much to work with, and every item still correlates positively. For Instrument E, alpha is unstable by construction: with three respondents, most items got an identical rating from all three, leaving several with no variance at all. We say that where we report it rather than presenting a shaky number as if it were solid."</w:t>
       </w:r>
     </w:p>
     <w:p>
@@ -2209,89 +2480,7 @@
         <w:pStyle w:val="Heading2"/>
       </w:pPr>
       <w:r>
-        <w:t>Key points</w:t>
-      </w:r>
-    </w:p>
-    <w:p>
-      <w:pPr/>
-      <w:r>
-        <w:t>Mostly descriptive statistics: frequency distributions and weighted means, with standard deviation.</w:t>
-      </w:r>
-    </w:p>
-    <w:p>
-      <w:pPr/>
-      <w:r>
-        <w:t>One inferential test on the four before-and-after items: the Wilcoxon test. The signed-rank form is used where enough respondents link their two surveys with the optional email address; the rank-sum form (Mann-Whitney U) is used between the two groups where they don't. In this study's actual data, Instrument C's comparison used the rank-sum form, because none of its respondents supplied a linking address.</w:t>
-      </w:r>
-    </w:p>
-    <w:p>
-      <w:pPr/>
-      <w:r>
-        <w:t>The ranking-agreement instrument, and the Spearman correlation that would have analysed it, were both withdrawn. If you see Spearman mentioned anywhere, it is stale.</w:t>
-      </w:r>
-    </w:p>
-    <w:p>
-      <w:pPr/>
-      <w:r>
-        <w:t>System Usability Scale scored by its own published method, 0 to 100.</w:t>
-      </w:r>
-    </w:p>
-    <w:p>
-      <w:pPr/>
-      <w:r>
-        <w:t>The interpretation scale is FIXED IN ADVANCE: 4.50-5.00 excellent, 3.50-4.49 good, 2.50-3.49 fair, 1.50-2.49 poor, 1.00-1.49 very poor. Every one of our five instruments' quality-characteristic means falls in the good band except the IT expert overall mean, which is the only one in the excellent band.</w:t>
-      </w:r>
-    </w:p>
-    <w:p>
-      <w:pPr>
-        <w:pStyle w:val="Heading2"/>
-      </w:pPr>
-      <w:r>
-        <w:t>What should I remember?</w:t>
-      </w:r>
-    </w:p>
-    <w:p>
-      <w:pPr/>
-      <w:r>
-        <w:t>Wilcoxon (1945) and Mann &amp; Whitney (1947) are both cited, for the two forms of the same test — paired and unpaired.</w:t>
-      </w:r>
-    </w:p>
-    <w:p>
-      <w:pPr/>
-      <w:r>
-        <w:t>User means and expert means are NEVER pooled. They come from different kinds of judgement.</w:t>
-      </w:r>
-    </w:p>
-    <w:p>
-      <w:pPr/>
-      <w:r>
-        <w:t>The scale is published in advance so it cannot be chosen to suit the results.</w:t>
-      </w:r>
-    </w:p>
-    <w:p>
-      <w:pPr/>
-      <w:r>
-        <w:t>How to explain it to the panel: "Nearly all of it is descriptive: counts, percentages, and weighted means with standard deviations. The one inferential test is a Wilcoxon test, applied to the four items asked before and after use — paired where we could link respondents, unpaired where we couldn't."</w:t>
-      </w:r>
-    </w:p>
-    <w:p>
-      <w:pPr/>
-      <w:r>
-        <w:t>Possible question: Why Wilcoxon and not a paired or independent t-test?</w:t>
-      </w:r>
-    </w:p>
-    <w:p>
-      <w:pPr/>
-      <w:r>
-        <w:t>Simple answer: "Because our data is ordinal, a five-point agreement scale, and Wilcoxon is the appropriate test for ordinal data whether paired or independent. It also assumes no particular distribution, which a t-test does not."</w:t>
-      </w:r>
-    </w:p>
-    <w:p>
-      <w:pPr>
-        <w:pStyle w:val="Heading1"/>
-      </w:pPr>
-      <w:r>
-        <w:t>Validity and Reliability of the Instrument</w:t>
+        <w:t>Ethical Consideration</w:t>
       </w:r>
     </w:p>
     <w:p>
@@ -2306,13 +2495,13 @@
         <w:t xml:space="preserve">What is this section about? </w:t>
       </w:r>
       <w:r>
-        <w:t>How we make sure our questionnaires measure what they claim to.</w:t>
+        <w:t>How we protect the people who answer, and the applicants whose data the system holds.</w:t>
       </w:r>
     </w:p>
     <w:p>
       <w:r>
         <w:rPr>
-          <w:b/>
+          <w:b w:val="0"/>
           <w:i w:val="0"/>
           <w:sz w:val="22"/>
         </w:rPr>
@@ -2325,7 +2514,7 @@
         <w:spacing w:after="60"/>
       </w:pPr>
       <w:r>
-        <w:t>Content validity: our adviser reviews every item against the question or ISO characteristic it was written for. Items judged not essential are reworded or removed, following Lawshe (1975).</w:t>
+        <w:t>Written permission from Clark Outsourcing HR and approval from the School of Computing before any data.</w:t>
       </w:r>
     </w:p>
     <w:p>
@@ -2334,7 +2523,7 @@
         <w:spacing w:after="60"/>
       </w:pPr>
       <w:r>
-        <w:t>Pilot test with three to five people who are not in the sample.</w:t>
+        <w:t>Consent shown at the start of every form, before any question.</w:t>
       </w:r>
     </w:p>
     <w:p>
@@ -2343,13 +2532,40 @@
         <w:spacing w:after="60"/>
       </w:pPr>
       <w:r>
-        <w:t>Internal consistency: Cronbach's alpha, computed per characteristic once responses are in, and reported as it stands even if it is low.</w:t>
+        <w:t>Data Privacy Act of 2012 compliance: hashed passwords, verified email, role-based access, applicant-facing data export and account deletion.</w:t>
+      </w:r>
+    </w:p>
+    <w:p>
+      <w:pPr>
+        <w:pStyle w:val="ListBullet"/>
+        <w:spacing w:after="60"/>
+      </w:pPr>
+      <w:r>
+        <w:t>The one third-party transfer — the optional Gemini extraction — is disclosed on the privacy page before use.</w:t>
+      </w:r>
+    </w:p>
+    <w:p>
+      <w:pPr>
+        <w:pStyle w:val="ListBullet"/>
+        <w:spacing w:after="60"/>
+      </w:pPr>
+      <w:r>
+        <w:t>Two fairness safeguards: the system never auto-rejects, and every status change carries a named recruiter.</w:t>
+      </w:r>
+    </w:p>
+    <w:p>
+      <w:pPr>
+        <w:pStyle w:val="ListBullet"/>
+        <w:spacing w:after="60"/>
+      </w:pPr>
+      <w:r>
+        <w:t>Raw responses in an access-restricted folder, destroyed after the study is approved.</w:t>
       </w:r>
     </w:p>
     <w:p>
       <w:r>
         <w:rPr>
-          <w:b/>
+          <w:b w:val="0"/>
           <w:i w:val="0"/>
           <w:sz w:val="22"/>
         </w:rPr>
@@ -2362,7 +2578,7 @@
         <w:spacing w:after="60"/>
       </w:pPr>
       <w:r>
-        <w:t>Two names: Lawshe 1975 for content validity, Cronbach's alpha for internal consistency.</w:t>
+        <w:t>CONFIDENTIAL, not anonymous — and the paper explains the trade honestly. The optional email evidences that responses came from real people, and it is the only key that pairs before and after.</w:t>
       </w:r>
     </w:p>
     <w:p>
@@ -2371,7 +2587,16 @@
         <w:spacing w:after="60"/>
       </w:pPr>
       <w:r>
-        <w:t>The pilot test is the only stage where a problem we did not anticipate can surface, because every item is closed.</w:t>
+        <w:t>The re-identification risk the paper names is in the BACKGROUND items, not in prose: about ten HR respondents from a single department could recognise each other from age range, experience and position. So HR figures are reported in aggregate and no result pairs one respondent's background with their ratings.</w:t>
+      </w:r>
+    </w:p>
+    <w:p>
+      <w:pPr>
+        <w:pStyle w:val="ListBullet"/>
+        <w:spacing w:after="60"/>
+      </w:pPr>
+      <w:r>
+        <w:t>IT experts got test accounts and test records, so inspecting the system never meant reading a real applicant's resume.</w:t>
       </w:r>
     </w:p>
     <w:p>
@@ -2386,7 +2611,7 @@
         <w:t xml:space="preserve">How to explain it to the panel: </w:t>
       </w:r>
       <w:r>
-        <w:t>"Three things. Our adviser checks every item against what it is supposed to measure, following Lawshe. We pilot it with three to five people outside the sample. And we compute Cronbach's alpha per characteristic once the responses are in, and report it as it comes out."</w:t>
+        <w:t>"We got permission and consent first. Responses are confidential and never reported so anyone can be identified. No researcher watched anyone answer. And our invitation says plainly that critical ratings are as useful to us as favourable ones."</w:t>
       </w:r>
     </w:p>
     <w:p>
@@ -2401,7 +2626,7 @@
         <w:t xml:space="preserve">Possible question: </w:t>
       </w:r>
       <w:r>
-        <w:t>What if Cronbach's alpha comes out low?</w:t>
+        <w:t>Your responses are not anonymous. Is that a problem?</w:t>
       </w:r>
     </w:p>
     <w:p>
@@ -2416,15 +2641,15 @@
         <w:t xml:space="preserve">Simple answer: </w:t>
       </w:r>
       <w:r>
-        <w:t>"We report it as it stands and say what it means for that characteristic. We committed to that in advance, so we cannot quietly drop an inconvenient number."</w:t>
-      </w:r>
-    </w:p>
-    <w:p>
-      <w:pPr>
-        <w:pStyle w:val="Heading1"/>
-      </w:pPr>
-      <w:r>
-        <w:t>Ethical Considerations</w:t>
+        <w:t>"We call them confidential rather than anonymous, and we explain why. The optional email does two things a self-generated code cannot: it evidences that answers came from real people who agreed to take part, and it is the key that pairs a person's before and after answers. The cost is that a respondent who supplies one is identifiable to us, so we hold them under stated retention terms and delete them with the raw data."</w:t>
+      </w:r>
+    </w:p>
+    <w:p>
+      <w:pPr>
+        <w:pStyle w:val="Heading2"/>
+      </w:pPr>
+      <w:r>
+        <w:t>Results</w:t>
       </w:r>
     </w:p>
     <w:p>
@@ -2439,13 +2664,13 @@
         <w:t xml:space="preserve">What is this section about? </w:t>
       </w:r>
       <w:r>
-        <w:t>How we protect the people who answer.</w:t>
+        <w:t>The findings, organised by respondent group and tied to the three objectives.</w:t>
       </w:r>
     </w:p>
     <w:p>
       <w:r>
         <w:rPr>
-          <w:b/>
+          <w:b w:val="0"/>
           <w:i w:val="0"/>
           <w:sz w:val="22"/>
         </w:rPr>
@@ -2458,7 +2683,7 @@
         <w:spacing w:after="60"/>
       </w:pPr>
       <w:r>
-        <w:t>Written permission from the company and approval from the School before any data.</w:t>
+        <w:t>Job Seeker Results: profile (Table 3), pre-use ratings (Table 4), quality means with alpha (Table 8), highest and lowest items (Table 9), SUS (Table 10), before-and-after comparison (Table 11).</w:t>
       </w:r>
     </w:p>
     <w:p>
@@ -2467,7 +2692,7 @@
         <w:spacing w:after="60"/>
       </w:pPr>
       <w:r>
-        <w:t>Informed consent shown before any question.</w:t>
+        <w:t>HR Results: profile (Table 5), pre-use ratings (Table 6), 100-point allocation (Table 7), quality means with alpha (Table 12), ordering and fit judgements (Table 13).</w:t>
       </w:r>
     </w:p>
     <w:p>
@@ -2476,7 +2701,7 @@
         <w:spacing w:after="60"/>
       </w:pPr>
       <w:r>
-        <w:t>Responses are confidential and never reported in identifiable form.</w:t>
+        <w:t>IT Expert Results: quality means with alpha (Table 14).</w:t>
       </w:r>
     </w:p>
     <w:p>
@@ -2485,31 +2710,13 @@
         <w:spacing w:after="60"/>
       </w:pPr>
       <w:r>
-        <w:t>No researcher present while respondents answer.</w:t>
-      </w:r>
-    </w:p>
-    <w:p>
-      <w:pPr>
-        <w:pStyle w:val="ListBullet"/>
-        <w:spacing w:after="60"/>
-      </w:pPr>
-      <w:r>
-        <w:t>The invitation states that critical ratings are as useful as favourable ones.</w:t>
-      </w:r>
-    </w:p>
-    <w:p>
-      <w:pPr>
-        <w:pStyle w:val="ListBullet"/>
-        <w:spacing w:after="60"/>
-      </w:pPr>
-      <w:r>
-        <w:t>Data stored in an access-restricted folder held only by the researchers.</w:t>
+        <w:t>Table 15 sets all three groups side by side.</w:t>
       </w:r>
     </w:p>
     <w:p>
       <w:r>
         <w:rPr>
-          <w:b/>
+          <w:b w:val="0"/>
           <w:i w:val="0"/>
           <w:sz w:val="22"/>
         </w:rPr>
@@ -2522,7 +2729,7 @@
         <w:spacing w:after="60"/>
       </w:pPr>
       <w:r>
-        <w:t>Confidential, not anonymous — and we state the difference honestly.</w:t>
+        <w:t>Job seekers 4.28 overall, HR 4.22 overall — both GOOD. IT experts 4.80 — EXCELLENT.</w:t>
       </w:r>
     </w:p>
     <w:p>
@@ -2531,7 +2738,25 @@
         <w:spacing w:after="60"/>
       </w:pPr>
       <w:r>
-        <w:t>The four measures against self-evaluation bias: confidential responses, no researcher present, an invitation that welcomes low ratings, and a scale published before data collection.</w:t>
+        <w:t>Never say the users rated it excellent. No characteristic from either user group reaches 4.50.</w:t>
+      </w:r>
+    </w:p>
+    <w:p>
+      <w:pPr>
+        <w:pStyle w:val="ListBullet"/>
+        <w:spacing w:after="60"/>
+      </w:pPr>
+      <w:r>
+        <w:t>Only the group that INSPECTED the system put it in the top band. The two groups that USED it did not. Table 15's note makes that point deliberately, and it is a more honest headline than the 4.80.</w:t>
+      </w:r>
+    </w:p>
+    <w:p>
+      <w:pPr>
+        <w:pStyle w:val="ListBullet"/>
+        <w:spacing w:after="60"/>
+      </w:pPr>
+      <w:r>
+        <w:t>The joint-lowest HR item, at 4.00, is that the ranked list was quicker than current practice — the item that most directly tests the time-saving claim. Volunteer it.</w:t>
       </w:r>
     </w:p>
     <w:p>
@@ -2546,7 +2771,7 @@
         <w:t xml:space="preserve">How to explain it to the panel: </w:t>
       </w:r>
       <w:r>
-        <w:t>"We get permission and consent first. Responses are confidential and never reported so anyone can be identified. No researcher watches anyone answer. And our invitation says plainly that critical ratings are as useful to us as favourable ones."</w:t>
+        <w:t>"Three respondent groups, five instruments. Job seekers and HR personnel rated every characteristic in the good band. IT experts, who inspected the system and its source code rather than using it, rated all five in the excellent band. We report them side by side and deliberately do not pool them."</w:t>
       </w:r>
     </w:p>
     <w:p>
@@ -2561,7 +2786,7 @@
         <w:t xml:space="preserve">Possible question: </w:t>
       </w:r>
       <w:r>
-        <w:t>Your responses are not anonymous. Is that a problem?</w:t>
+        <w:t>Your IT experts rated you 4.80. Isn't that suspiciously high?</w:t>
       </w:r>
     </w:p>
     <w:p>
@@ -2576,12 +2801,158 @@
         <w:t xml:space="preserve">Simple answer: </w:t>
       </w:r>
       <w:r>
-        <w:t>"We call them confidential rather than anonymous, and we explain why in the paper. We ask for an optional email so we can match a person's before answer to their own after answer, which the paired comparison requires. It was a departure from our original plan and we record it as one."</w:t>
-      </w:r>
-    </w:p>
-    <w:p>
-      <w:r>
-        <w:br w:type="page"/>
+        <w:t>"It is high, and there are only three of them, so it supports no inference beyond those three people. What I would point to instead is that the two groups who actually USED the system both landed in the good band, not the excellent one, and no characteristic they rated reached 4.50. The expert figure tells you the code and the security held up to inspection; it does not tell you the system is excellent to use."</w:t>
+      </w:r>
+    </w:p>
+    <w:p>
+      <w:pPr>
+        <w:pStyle w:val="Heading2"/>
+      </w:pPr>
+      <w:r>
+        <w:t>Summary of Findings, Discussion, Conclusion and Recommendations</w:t>
+      </w:r>
+    </w:p>
+    <w:p>
+      <w:pPr>
+        <w:spacing w:after="60"/>
+      </w:pPr>
+      <w:r>
+        <w:rPr>
+          <w:b/>
+          <w:color w:val="16305C"/>
+        </w:rPr>
+        <w:t xml:space="preserve">What is this section about? </w:t>
+      </w:r>
+      <w:r>
+        <w:t>Chapter 5, organised by the three objectives throughout.</w:t>
+      </w:r>
+    </w:p>
+    <w:p>
+      <w:r>
+        <w:rPr>
+          <w:b w:val="0"/>
+          <w:i w:val="0"/>
+          <w:sz w:val="22"/>
+        </w:rPr>
+        <w:t>Key points</w:t>
+      </w:r>
+    </w:p>
+    <w:p>
+      <w:pPr>
+        <w:pStyle w:val="ListBullet"/>
+        <w:spacing w:after="60"/>
+      </w:pPr>
+      <w:r>
+        <w:t>Summary of Findings: one paragraph per objective.</w:t>
+      </w:r>
+    </w:p>
+    <w:p>
+      <w:pPr>
+        <w:pStyle w:val="ListBullet"/>
+        <w:spacing w:after="60"/>
+      </w:pPr>
+      <w:r>
+        <w:t>Discussion: one block per objective, each connecting the data to the literature — Wan Hanafi et al. (2022) for Objective 1, Leony et al. (2024) for Objective 2, Aulia et al. (2025) for Objective 3.</w:t>
+      </w:r>
+    </w:p>
+    <w:p>
+      <w:pPr>
+        <w:pStyle w:val="ListBullet"/>
+        <w:spacing w:after="60"/>
+      </w:pPr>
+      <w:r>
+        <w:t>Discussion closes with three limitations qualifying how the results should be read: favourable bias, small purposive samples, and a single session of guided use.</w:t>
+      </w:r>
+    </w:p>
+    <w:p>
+      <w:pPr>
+        <w:pStyle w:val="ListBullet"/>
+        <w:spacing w:after="60"/>
+      </w:pPr>
+      <w:r>
+        <w:t>Conclusion: one paragraph per objective, then a closing paragraph.</w:t>
+      </w:r>
+    </w:p>
+    <w:p>
+      <w:pPr>
+        <w:pStyle w:val="ListBullet"/>
+        <w:spacing w:after="60"/>
+      </w:pPr>
+      <w:r>
+        <w:t>Recommendations in three groups: for the System, for the Partner Company, for Future Research.</w:t>
+      </w:r>
+    </w:p>
+    <w:p>
+      <w:r>
+        <w:rPr>
+          <w:b w:val="0"/>
+          <w:i w:val="0"/>
+          <w:sz w:val="22"/>
+        </w:rPr>
+        <w:t>What should I remember?</w:t>
+      </w:r>
+    </w:p>
+    <w:p>
+      <w:pPr>
+        <w:pStyle w:val="ListBullet"/>
+        <w:spacing w:after="60"/>
+      </w:pPr>
+      <w:r>
+        <w:t>The four recommendations for future research are worth memorising, because "what would you do next?" is almost guaranteed: use a respondent-generated linking code; record demographics in the post-use instrument; measure ranking correspondence directly by having recruiters order applicants blind; and extend beyond a single partner company.</w:t>
+      </w:r>
+    </w:p>
+    <w:p>
+      <w:pPr>
+        <w:pStyle w:val="ListBullet"/>
+        <w:spacing w:after="60"/>
+      </w:pPr>
+      <w:r>
+        <w:t>The three system recommendations come straight out of findings: relevance-based experience scoring (4 of 10 HR spotted the duration-not-relevance issue), better visibility of the per-posting weight control (3 of 10 did not notice it), and better framing of a lower-than-expected score for job seekers.</w:t>
+      </w:r>
+    </w:p>
+    <w:p>
+      <w:pPr>
+        <w:spacing w:after="60"/>
+      </w:pPr>
+      <w:r>
+        <w:rPr>
+          <w:b/>
+          <w:color w:val="16305C"/>
+        </w:rPr>
+        <w:t xml:space="preserve">How to explain it to the panel: </w:t>
+      </w:r>
+      <w:r>
+        <w:t>"Chapter 5 is organised by our three objectives. Each gets a summary paragraph, a discussion block that ties the data to the literature, and a conclusion paragraph. The recommendations are split between the system, the partner company, and future research."</w:t>
+      </w:r>
+    </w:p>
+    <w:p>
+      <w:pPr>
+        <w:spacing w:after="60"/>
+      </w:pPr>
+      <w:r>
+        <w:rPr>
+          <w:b/>
+          <w:color w:val="16305C"/>
+        </w:rPr>
+        <w:t xml:space="preserve">Possible question: </w:t>
+      </w:r>
+      <w:r>
+        <w:t>What would you do differently if you started again?</w:t>
+      </w:r>
+    </w:p>
+    <w:p>
+      <w:pPr>
+        <w:spacing w:after="60"/>
+      </w:pPr>
+      <w:r>
+        <w:rPr>
+          <w:b/>
+          <w:color w:val="16305C"/>
+        </w:rPr>
+        <w:t xml:space="preserve">Simple answer: </w:t>
+      </w:r>
+      <w:r>
+        <w:t>"Collect a respondent-generated linking code instead of an optional email. That single change would have given us the paired comparison we designed for, on all forty-six respondents instead of a ceiling of twenty, and it would have kept the responses closer to anonymous at the same time."</w:t>
       </w:r>
     </w:p>
     <w:p>
@@ -2589,155 +2960,17 @@
         <w:pStyle w:val="Heading1"/>
       </w:pPr>
       <w:r>
-        <w:t>RESULTS SECTION — all five instruments now have results</w:t>
-      </w:r>
-    </w:p>
-    <w:p>
-      <w:pPr/>
-      <w:r>
-        <w:t>This changed since the last version of this reviewer. All five instruments have been administered and every one has a results section in the paper: Requirement-Analysis Survey (Instrument A), HR and Recruitment Survey (Instrument B), Job Seeker System Evaluation (Instrument C), HR System Evaluation (Instrument D), IT Expert Evaluation (Instrument E). A sixth instrument — a ranking-agreement check that would have compared the system's order against a recruiter's own — was planned but never administered, and was removed from the paper entirely rather than left as a promise with no data. If you are asked, the honest answer is: "We planned that comparison, decided not to run it with data we could not stand behind, and withdrew it from the paper rather than leave a gap the panel would find on their own." Do not describe it as still pending — it no longer exists in the manuscript.</w:t>
-      </w:r>
-    </w:p>
-    <w:p>
-      <w:pPr>
-        <w:pStyle w:val="Heading2"/>
-      </w:pPr>
-      <w:r>
-        <w:t>Instrument A — Requirement-Analysis Survey</w:t>
-      </w:r>
-    </w:p>
-    <w:p>
-      <w:pPr/>
-      <w:r>
-        <w:t>Unchanged from before. 108 responses, 103 valid, 46 in the target population, 57 outside it and never pooled. Formatting frustrating 4.00, cannot tell if qualified 3.96, worry a computer rejects me first 3.93. 80.4% of the 46 have never paid for resume help. 48.7% of those who applied are told why never or rarely.</w:t>
-      </w:r>
-    </w:p>
-    <w:p>
-      <w:pPr>
-        <w:pStyle w:val="Heading2"/>
-      </w:pPr>
-      <w:r>
-        <w:t>Instrument B — HR and Recruitment Survey</w:t>
-      </w:r>
-    </w:p>
-    <w:p>
-      <w:pPr/>
-      <w:r>
-        <w:t>Eleven HR respondents, all consenting. Two strongest results: poor formatting makes information hard to find, 4.64; would only trust a score if shown how it was calculated, 4.64. Weakest: screening takes more time than it should, exactly neutral at 3.00. Asked to split 100 points across skills, education and experience, the mean was 44.9 / 21.2 / 33.9 against our 50 / 25 / 25 default, and education came last for every one of the eleven respondents without exception. We did not change the defaults in response to this — the paper commits in advance to not tuning defaults to match the same people who later evaluate the system. Nine of eleven already use a paid applicant tracking system.</w:t>
-      </w:r>
-    </w:p>
-    <w:p>
-      <w:pPr/>
-      <w:r>
-        <w:t>If asked why the default still says 50/25/25 when recruiters want something closer to 45/21/34: "Changing the default to match what our respondents said they'd prefer would make our own evaluation of that default circular. Instead we built per-posting rebalancing, which lets a recruiter set their own weights for an opening. The finding shows why that feature matters, not that our default is wrong."</w:t>
-      </w:r>
-    </w:p>
-    <w:p>
-      <w:pPr>
-        <w:pStyle w:val="Heading2"/>
-      </w:pPr>
-      <w:r>
-        <w:t>Instrument C — Job Seeker System Evaluation</w:t>
-      </w:r>
-    </w:p>
-    <w:p>
-      <w:pPr/>
-      <w:r>
-        <w:t>Forty-six job seekers, after using the finished system. Functional suitability 4.30, usability 4.28, reliability 4.23 — the "good" band, not "excellent." System Usability Scale 74.7, above the conventional average of 68 for 42 of the 46. Two items repeated from Instrument A moved in the right direction: worry about computer screening fell from 3.93 to 2.65 (a large, significant drop); not being able to judge a posting fell from 3.96 to 3.43 (smaller, still significant). Being guided step by step was the most-named useful feature; 34 of 46 said nothing was frustrating.</w:t>
-      </w:r>
-    </w:p>
-    <w:p>
-      <w:pPr/>
-      <w:r>
-        <w:t>One thing to know before anyone asks: the comparison above is between two DIFFERENT groups of 46 people, not the same 46 measured twice. No email or code was collected that could link one respondent's before-answer to their after-answer, so the paper compares the two groups statistically (a Wilcoxon rank-sum test) instead of pairing individuals. If asked: "We didn't collect anything that could identify who answered what, on purpose, so people would report a difficulty honestly rather than feel watched. That means we compare two groups instead of matched pairs — a real result, just a slightly less powerful kind of test."</w:t>
-      </w:r>
-    </w:p>
-    <w:p>
-      <w:pPr>
-        <w:pStyle w:val="Heading2"/>
-      </w:pPr>
-      <w:r>
-        <w:t>Instrument D — HR System Evaluation</w:t>
-      </w:r>
-    </w:p>
-    <w:p>
-      <w:pPr/>
-      <w:r>
-        <w:t>Ten HR respondents, every one of the ten tasks on the sheet completed by all ten. Functional suitability 4.17, usability 4.22, reliability 4.33 — again the good band. The item testing whether the ranked list is quicker than current practice was the joint-lowest of the fourteen quality items, at 4.00. Four of ten correctly identified that the engine measures how long someone worked, not whether the work was relevant — that's a real property of the formula, not a misunderstanding. All ten placed the system's top applicant within their own top three. Every one of the ten rated trust in the system at exactly 4 — no variation at all.</w:t>
-      </w:r>
-    </w:p>
-    <w:p>
-      <w:pPr>
-        <w:pStyle w:val="Heading2"/>
-      </w:pPr>
-      <w:r>
-        <w:t>Instrument E — IT Expert Evaluation</w:t>
-      </w:r>
-    </w:p>
-    <w:p>
-      <w:pPr/>
-      <w:r>
-        <w:t>Three IT experts. Overall 4.80, the only result in the "excellent" band. Security highest at 4.89, usability lowest at 4.67. Only two of the eighty-one ratings were below 4, both 3s, both on usability items and both from the most experienced respondent — that is the only disagreement anywhere in the instrument.</w:t>
-      </w:r>
-    </w:p>
-    <w:p>
-      <w:pPr>
-        <w:pStyle w:val="Heading2"/>
-      </w:pPr>
-      <w:r>
-        <w:t>Chapter 5 — now written</w:t>
-      </w:r>
-    </w:p>
-    <w:p>
-      <w:pPr/>
-      <w:r>
-        <w:t>Summary of Findings, Conclusions and Recommendations now exist in the paper, organised by research question. The headline conclusion: the system's transparency and human-control design (never auto-rejects, always shows how a score was reached) is the most strongly and consistently supported finding across every instrument that touches it. The weakest supported claim is that the system saves screening time — neutral in Instrument B before use, and the joint-lowest item in Instrument D after use. The conclusion says this plainly rather than only reporting the good numbers.</w:t>
-      </w:r>
-    </w:p>
-    <w:p>
-      <w:pPr>
-        <w:pStyle w:val="Heading1"/>
-      </w:pPr>
-      <w:r>
-        <w:t>SECTIONS THE PANEL MAY EXPECT THAT WE STILL DO NOT HAVE</w:t>
-      </w:r>
-    </w:p>
-    <w:p>
-      <w:pPr/>
-      <w:r>
-        <w:t>Much shorter than the old version of this section, because Chapter 4's results and Chapter 5 are both written now. What's actually still missing:</w:t>
-      </w:r>
-    </w:p>
-    <w:p>
-      <w:pPr/>
-      <w:r>
-        <w:t>Tables are now in the paper. Fifteen APA-style tables cover the respondent groups, the interpretation scale, every instrument's ratings, the quality-characteristic means with Cronbach's alpha alongside them, and the cross-instrument comparison in Chapter 5. This is no longer a gap.</w:t>
-      </w:r>
-    </w:p>
-    <w:p>
-      <w:pPr/>
-      <w:r>
-        <w:t>The Table of Contents is a real Word field now (right-click it and choose Update Field, or press F9, to fill in page numbers). The front matter also carries a completed List of Figures, a List of Tables, and a list of the five appendices. This is no longer a gap.</w:t>
-      </w:r>
-    </w:p>
-    <w:p>
-      <w:pPr/>
-      <w:r>
-        <w:t>No chapter numbers, and that is confirmed correct, not just unaddressed. We checked an actual submitted Holy Angel University School of Computing capstone: it uses no chapter numbers anywhere, going directly from Introduction to Review of Related Literature to Method to Results. Adding "Chapter 1" labels was tried and then reverted for exactly this reason. If a panelist asks why there are no chapter numbers, the answer is that the program's own manuscripts don't use them.</w:t>
-      </w:r>
-    </w:p>
-    <w:p>
-      <w:pPr/>
-      <w:r>
-        <w:t>Appendices now run to E. Appendix D is the actual letter of request sent to and signed by Clark Outsourcing (Ms. Gia Jaculbia, HR), noted by our adviser and countersigned by the Dean. Appendix E is a User Manual covering the Job Seeker and Recruiter/HR sides of the deployed system. Still missing, and needing real documents rather than something we can draft: the plagiarism certificate (check with the School of Computing on their official process), an editor's note, and our CVs. Still missing but buildable on request: an Administrator Manual, system screenshots, and a formal Functional/Non-Functional Requirements list.</w:t>
-      </w:r>
-    </w:p>
-    <w:p>
-      <w:pPr>
-        <w:pStyle w:val="Heading1"/>
-      </w:pPr>
-      <w:r>
-        <w:t>DO THE SECTIONS AGREE WITH EACH OTHER?</w:t>
+        <w:t>3. Does the Chain Hold?</w:t>
+      </w:r>
+    </w:p>
+    <w:p>
+      <w:r>
+        <w:rPr>
+          <w:b w:val="0"/>
+          <w:i w:val="0"/>
+          <w:sz w:val="22"/>
+        </w:rPr>
+        <w:t>The chain a panel checks is: Problem, then Objectives, then System, then Results, then Conclusion. Checked against this version of the manuscript:</w:t>
       </w:r>
     </w:p>
     <w:tbl>
@@ -2754,7 +2987,7 @@
       <w:tr>
         <w:tc>
           <w:tcPr>
-            <w:tcW w:type="dxa" w:w="2304"/>
+            <w:tcW w:type="dxa" w:w="2160"/>
           </w:tcPr>
           <w:p>
             <w:r/>
@@ -2768,7 +3001,7 @@
         </w:tc>
         <w:tc>
           <w:tcPr>
-            <w:tcW w:type="dxa" w:w="1440"/>
+            <w:tcW w:type="dxa" w:w="1152"/>
           </w:tcPr>
           <w:p>
             <w:r/>
@@ -2776,13 +3009,13 @@
               <w:rPr>
                 <w:b/>
               </w:rPr>
-              <w:t>Does it hold?</w:t>
+              <w:t>Holds?</w:t>
             </w:r>
           </w:p>
         </w:tc>
         <w:tc>
           <w:tcPr>
-            <w:tcW w:type="dxa" w:w="5184"/>
+            <w:tcW w:type="dxa" w:w="5616"/>
           </w:tcPr>
           <w:p>
             <w:r/>
@@ -2798,7 +3031,7 @@
       <w:tr>
         <w:tc>
           <w:tcPr>
-            <w:tcW w:type="dxa" w:w="2304"/>
+            <w:tcW w:type="dxa" w:w="2160"/>
           </w:tcPr>
           <w:p>
             <w:r/>
@@ -2809,7 +3042,7 @@
         </w:tc>
         <w:tc>
           <w:tcPr>
-            <w:tcW w:type="dxa" w:w="1440"/>
+            <w:tcW w:type="dxa" w:w="1152"/>
           </w:tcPr>
           <w:p>
             <w:r/>
@@ -2820,12 +3053,12 @@
         </w:tc>
         <w:tc>
           <w:tcPr>
-            <w:tcW w:type="dxa" w:w="5184"/>
+            <w:tcW w:type="dxa" w:w="5616"/>
           </w:tcPr>
           <w:p>
             <w:r/>
             <w:r>
-              <w:t>Each problem named has an objective that answers it. Formatting difficulty maps to the builder. Opacity maps to showing the score and the missing skills.</w:t>
+              <w:t>Each problem named has an objective that answers it. Formatting difficulty maps to the builder. Opacity maps to showing the score and the missing-skill count.</w:t>
             </w:r>
           </w:p>
         </w:tc>
@@ -2833,7 +3066,7 @@
       <w:tr>
         <w:tc>
           <w:tcPr>
-            <w:tcW w:type="dxa" w:w="2304"/>
+            <w:tcW w:type="dxa" w:w="2160"/>
           </w:tcPr>
           <w:p>
             <w:r/>
@@ -2844,7 +3077,7 @@
         </w:tc>
         <w:tc>
           <w:tcPr>
-            <w:tcW w:type="dxa" w:w="1440"/>
+            <w:tcW w:type="dxa" w:w="1152"/>
           </w:tcPr>
           <w:p>
             <w:r/>
@@ -2855,12 +3088,12 @@
         </w:tc>
         <w:tc>
           <w:tcPr>
-            <w:tcW w:type="dxa" w:w="5184"/>
+            <w:tcW w:type="dxa" w:w="5616"/>
           </w:tcPr>
           <w:p>
             <w:r/>
             <w:r>
-              <w:t>Eight of the nine objectives are built and can be demonstrated. Objective 9 is partly done.</w:t>
+              <w:t>All three are built and can be demonstrated live.</w:t>
             </w:r>
           </w:p>
         </w:tc>
@@ -2868,7 +3101,7 @@
       <w:tr>
         <w:tc>
           <w:tcPr>
-            <w:tcW w:type="dxa" w:w="2304"/>
+            <w:tcW w:type="dxa" w:w="2160"/>
           </w:tcPr>
           <w:p>
             <w:r/>
@@ -2879,7 +3112,7 @@
         </w:tc>
         <w:tc>
           <w:tcPr>
-            <w:tcW w:type="dxa" w:w="1440"/>
+            <w:tcW w:type="dxa" w:w="1152"/>
           </w:tcPr>
           <w:p>
             <w:r/>
@@ -2890,7 +3123,7 @@
         </w:tc>
         <w:tc>
           <w:tcPr>
-            <w:tcW w:type="dxa" w:w="5184"/>
+            <w:tcW w:type="dxa" w:w="5616"/>
           </w:tcPr>
           <w:p>
             <w:r/>
@@ -2903,18 +3136,18 @@
       <w:tr>
         <w:tc>
           <w:tcPr>
-            <w:tcW w:type="dxa" w:w="2304"/>
+            <w:tcW w:type="dxa" w:w="2160"/>
           </w:tcPr>
           <w:p>
             <w:r/>
             <w:r>
-              <w:t>SOP to Instruments</w:t>
+              <w:t>Research questions to Instruments</w:t>
             </w:r>
           </w:p>
         </w:tc>
         <w:tc>
           <w:tcPr>
-            <w:tcW w:type="dxa" w:w="1440"/>
+            <w:tcW w:type="dxa" w:w="1152"/>
           </w:tcPr>
           <w:p>
             <w:r/>
@@ -2925,12 +3158,12 @@
         </w:tc>
         <w:tc>
           <w:tcPr>
-            <w:tcW w:type="dxa" w:w="5184"/>
+            <w:tcW w:type="dxa" w:w="5616"/>
           </w:tcPr>
           <w:p>
             <w:r/>
             <w:r>
-              <w:t>Q1 and Q2 map to Instrument A, Q3 to B, Q4 to C, Q5 to D, Q6 to E, Q7 to F.</w:t>
+              <w:t>Table 1 maps them explicitly: RQ1 and RQ2 to A, RQ3 to B, RQ4 to C, RQ5 to D, RQ6 to E.</w:t>
             </w:r>
           </w:p>
         </w:tc>
@@ -2938,34 +3171,34 @@
       <w:tr>
         <w:tc>
           <w:tcPr>
-            <w:tcW w:type="dxa" w:w="2304"/>
+            <w:tcW w:type="dxa" w:w="2160"/>
           </w:tcPr>
           <w:p>
             <w:r/>
             <w:r>
-              <w:t>SOP to Results</w:t>
+              <w:t>Instruments to Results</w:t>
             </w:r>
           </w:p>
         </w:tc>
         <w:tc>
           <w:tcPr>
-            <w:tcW w:type="dxa" w:w="1440"/>
+            <w:tcW w:type="dxa" w:w="1152"/>
           </w:tcPr>
           <w:p>
             <w:r/>
             <w:r>
-              <w:t>PARTLY</w:t>
+              <w:t>YES</w:t>
             </w:r>
           </w:p>
         </w:tc>
         <w:tc>
           <w:tcPr>
-            <w:tcW w:type="dxa" w:w="5184"/>
+            <w:tcW w:type="dxa" w:w="5616"/>
           </w:tcPr>
           <w:p>
             <w:r/>
             <w:r>
-              <w:t>Q1 and Q2 are answered with real data. Q3 to Q7 are not answered yet.</w:t>
+              <w:t>All five instruments were administered and all five have a results section.</w:t>
             </w:r>
           </w:p>
         </w:tc>
@@ -2973,7 +3206,7 @@
       <w:tr>
         <w:tc>
           <w:tcPr>
-            <w:tcW w:type="dxa" w:w="2304"/>
+            <w:tcW w:type="dxa" w:w="2160"/>
           </w:tcPr>
           <w:p>
             <w:r/>
@@ -2984,32 +3217,44 @@
         </w:tc>
         <w:tc>
           <w:tcPr>
-            <w:tcW w:type="dxa" w:w="1440"/>
+            <w:tcW w:type="dxa" w:w="1152"/>
           </w:tcPr>
           <w:p>
             <w:r/>
             <w:r>
-              <w:t>NOT YET</w:t>
+              <w:t>MOSTLY</w:t>
             </w:r>
           </w:p>
         </w:tc>
         <w:tc>
           <w:tcPr>
-            <w:tcW w:type="dxa" w:w="5184"/>
+            <w:tcW w:type="dxa" w:w="5616"/>
           </w:tcPr>
           <w:p>
             <w:r/>
             <w:r>
-              <w:t>There is no conclusion chapter, because the evaluation results it would rest on do not exist yet.</w:t>
+              <w:t>The Conclusion follows the Results faithfully with one exception, listed as Defect 1 below.</w:t>
             </w:r>
           </w:p>
         </w:tc>
       </w:tr>
     </w:tbl>
-    <w:p>
-      <w:pPr/>
-      <w:r>
-        <w:t>We checked the chain again: Problem, then Objectives, then System, then Results, then Conclusion. Everything below is current as of the last update to the manuscript.</w:t>
+    <w:p/>
+    <w:p>
+      <w:pPr>
+        <w:pStyle w:val="Heading1"/>
+      </w:pPr>
+      <w:r>
+        <w:t>4. Defects Still in This Version of the File</w:t>
+      </w:r>
+    </w:p>
+    <w:p>
+      <w:r>
+        <w:rPr>
+          <w:b/>
+          <w:color w:val="C1272D"/>
+        </w:rPr>
+        <w:t>These are real and checkable. Fix them before printing. They are listed worst first.</w:t>
       </w:r>
     </w:p>
     <w:p>
@@ -3017,88 +3262,82 @@
         <w:pStyle w:val="Heading2"/>
       </w:pPr>
       <w:r>
-        <w:t>Mismatches found and fixed this round</w:t>
-      </w:r>
-    </w:p>
-    <w:p>
-      <w:pPr/>
-      <w:r>
-        <w:t>Application pipeline. Older copies of this reviewer said ten statuses. It is NINE: submitted, scheduling, initial interview, testing, shortlisted, final interview, offer, hired, rejected. "Withdrawn" and a legacy "review" status exist for record-keeping but are not part of the nine-stage pipeline shown on the dashboard. If you see "ten" or "six" or "five" anywhere, it is wrong — say nine.</w:t>
-      </w:r>
-    </w:p>
-    <w:p>
-      <w:pPr/>
-      <w:r>
-        <w:t>Test count. It is TWO HUNDRED AND THIRTY-TWO automated tests across eleven suites, up from 228 after four new tests were added to catch a real bug in the calendar-link builder (below). If you see 222, 228 or 160, it is out of date.</w:t>
-      </w:r>
-    </w:p>
-    <w:p>
-      <w:pPr/>
-      <w:r>
-        <w:t>The homepage used to say applicants can track "all five statuses" and showed an arrow diagram naming a status the system no longer has ("Under review"). Both are fixed: the homepage now says nine stages and names the real ones, credited to the partner company's actual hiring process.</w:t>
-      </w:r>
-    </w:p>
-    <w:p>
-      <w:pPr/>
-      <w:r>
-        <w:t>The Google Calendar "Add to interview invite" link was genuinely broken in the live system, not just in documentation. The date-range parameter was being percent-encoded in a way Google's calendar page doesn't accept, so clicking the button opened an event with no date or time on it at all. This is fixed and covered by four new tests that fail against the old code and pass against the fix. If asked whether the system had a real bug found during evaluation: yes, say so plainly — it was found, diagnosed and fixed, and that is a normal part of building software, not something to be defensive about.</w:t>
-      </w:r>
-    </w:p>
-    <w:p>
-      <w:pPr/>
-      <w:r>
-        <w:t>Instrument E used to mean a ranking-agreement check. That instrument was never administered and has been removed from the manuscript entirely — not just left out of the results, but taken out of the research questions, the Method section, Appendix A, and every reference to it anywhere in the paper. The IT Expert Evaluation, formerly Instrument F, was relettered to Instrument E so the set reads A through E with no gap. If you're asked about "Instrument F," the answer is: "There is no Instrument F. What used to be F is now E, and the old E was withdrawn because it was never run."</w:t>
-      </w:r>
-    </w:p>
-    <w:p>
-      <w:pPr/>
-      <w:r>
-        <w:t>The Wilcoxon test description in Appendix A, the Definition of Terms, and the Results section used to disagree with each other: Appendix A described a paired test requiring an email address, while Results reported comparing two unlinked groups. Reconciled: the study's real design (stated under Instrument / Simulation Tool) is an OPTIONAL email field on every instrument; where enough respondents supply one, the paired signed-rank test runs; where they don't, the unpaired rank-sum test runs instead. Both are genuine Wilcoxon tests. Instrument A's paired comparison used the email field (bounded at 29 respondents); Instrument C's did not, because none of its 46 respondents supplied one, so its comparison is unpaired.</w:t>
-      </w:r>
-    </w:p>
-    <w:p>
-      <w:r>
-        <w:t>Requirement Analysis was a Heading 1 sibling of Method, with Sample and Setting, Instrument / Simulation Tool, Data Gathering, Data Analysis, Validity and Reliability, and Ethical Consideration all nested under it — an 11,000-word section that was really the rest of the Method chapter, mis-parented under a much narrower heading. Demoted to Heading 2 so it sits correctly alongside those sections, under Method.</w:t>
-      </w:r>
-    </w:p>
-    <w:p>
-      <w:r>
-        <w:t>Figures 1, 4 and 5 were stale. Figure 1 said "52 aliases" for the skill vocabulary (it's 223 entries resolving to 104 skills) and listed the withdrawn ranking-agreement comparison as an evaluation output. Figure 4's system boundary was labelled "ResumeMatch PH," the project's old name. Figure 5 said "22 tables and 27 foreign keys" and was missing two live tables (application_notes, posting_certifications) entirely; the real count is 24 tables, 30 foreign keys. All three regenerated from the current text and the current schema. Figure 4 now sits on its own landscape page so its content is legible.</w:t>
-      </w:r>
-    </w:p>
-    <w:p>
-      <w:r>
-        <w:t>Cronbach's alpha was promised twice in Method and delivered nowhere in Results — a specific, checkable gap. Computed from the retained raw response files for every quality-characteristic group and added to the text and to Tables 8, 12 and 14. Instrument C is clean throughout (0.73 / 0.85 / 0.78). Instrument D's low functional-suitability figure (0.52) is explained rather than hidden — every item still correlates positively; ten respondents just agreed too narrowly on several items for alpha to have much variance to work with. Instrument E (n = 3) is reported with an explicit caution: several items got an identical rating from all three experts, which makes alpha mathematically unstable at that sample size, and the write-up says so instead of presenting a shaky number as if it meant something solid.</w:t>
-      </w:r>
-    </w:p>
-    <w:p>
-      <w:r>
-        <w:t>The SUS benchmark was declared as ~70 in Method but compared against 68 in Results — a benchmark picked after seeing the score, which is exactly what you don't want to look like. Fixed by declaring and reporting both real benchmarks (70.14 from Bangor et al., 2008; 68 from Sauro, 2011), so the mean is shown clearing both rather than depending on which was chosen.</w:t>
-      </w:r>
-    </w:p>
-    <w:p>
-      <w:r>
-        <w:t>Standard deviations used two different formulas in different sections. Instrument A computed the sample SD (n − 1); Instruments B, C, D and E computed the population SD (n). Normalised to the sample SD throughout — 31 figures changed, no mean changed, no finding changed.</w:t>
-      </w:r>
-    </w:p>
-    <w:p>
-      <w:r>
-        <w:t>Significance of the Study overclaimed a result. It said the partner company "gains an account of how its own screening practice compares with an automated ranking" — but the HR System Evaluation results say plainly that comparison was never measured, only recruiters' subjective impression of it. Reworded to match what the results actually support.</w:t>
-      </w:r>
-    </w:p>
-    <w:p>
-      <w:r>
-        <w:t>The title was ungrammatical. "...for Job Seekers and Partner Company in the Philippines" — singular, no article. Fixed to "Partner Companies," matching the Scope section's own distinction between what the system is designed to support (many companies) and what this pilot actually used (one). Fixed on the cover, title page, running head, and the Informed Consent Form in Appendix B.</w:t>
-      </w:r>
-    </w:p>
-    <w:p>
-      <w:r>
-        <w:t>The Method chapter was written as a future proposal. About twenty-five paragraphs still said "the researchers will use," "will be conducted," "will analyse" — describing data collection as something not yet done, while a few paragraphs fixed earlier in the same session already said "was chosen," "was developed." All converted to past tense to match the Results that follow.</w:t>
-      </w:r>
-    </w:p>
-    <w:p>
-      <w:r>
-        <w:t>The Abstract described a withdrawn design. It said data came from six instruments, including "in the sixth recruiters rank a fixed set of resumes so that their order can be compared against the system's" — the ranking-agreement comparison the Results explicitly say was never made. It also read entirely in future tense ("data will be gathered") for a study that is finished. Rewritten to the five-instrument design, past tense, same content otherwise.</w:t>
+        <w:t>Defect 1 — the Summary of Findings and the Discussion contradict the Results</w:t>
+      </w:r>
+    </w:p>
+    <w:p>
+      <w:pPr>
+        <w:spacing w:after="60"/>
+      </w:pPr>
+      <w:r>
+        <w:rPr>
+          <w:b/>
+          <w:color w:val="16305C"/>
+        </w:rPr>
+        <w:t xml:space="preserve">What it says: </w:t>
+      </w:r>
+      <w:r>
+        <w:t>Summary of Findings: "All 46 job seekers completed the core tasks including building a resume, browsing job openings, and applying to a posting." The Discussion repeats it: "All 46 job seekers completed the core tasks."</w:t>
+      </w:r>
+    </w:p>
+    <w:p>
+      <w:pPr>
+        <w:spacing w:after="60"/>
+      </w:pPr>
+      <w:r>
+        <w:rPr>
+          <w:b/>
+          <w:color w:val="16305C"/>
+        </w:rPr>
+        <w:t xml:space="preserve">What the Results actually say: </w:t>
+      </w:r>
+      <w:r>
+        <w:t>"All 46 respondents created an account and signed in. Thirty-seven built a resume in the step-by-step builder, 43 browsed job openings, 38 exported a resume, and 38 applied to a job opening."</w:t>
+      </w:r>
+    </w:p>
+    <w:p>
+      <w:pPr>
+        <w:spacing w:after="60"/>
+      </w:pPr>
+      <w:r>
+        <w:rPr>
+          <w:b/>
+          <w:color w:val="16305C"/>
+        </w:rPr>
+        <w:t xml:space="preserve">Why it matters: </w:t>
+      </w:r>
+      <w:r>
+        <w:t>Only signing in was done by all 46. Building a resume was done by 37, applying by 38. A panelist who reads the Results table and then the Conclusion will find the two disagreeing, and that is the single most damaging kind of finding because it looks like inflating a result.</w:t>
+      </w:r>
+    </w:p>
+    <w:p>
+      <w:pPr>
+        <w:spacing w:after="60"/>
+      </w:pPr>
+      <w:r>
+        <w:rPr>
+          <w:b/>
+          <w:color w:val="16305C"/>
+        </w:rPr>
+        <w:t xml:space="preserve">The fix: </w:t>
+      </w:r>
+      <w:r>
+        <w:t>Change both sentences to "All 46 job seekers created an account and signed in, and between 37 and 43 of them completed each of the core tasks." Or state the numbers directly.</w:t>
+      </w:r>
+    </w:p>
+    <w:p>
+      <w:pPr>
+        <w:spacing w:after="60"/>
+      </w:pPr>
+      <w:r>
+        <w:rPr>
+          <w:b/>
+          <w:color w:val="16305C"/>
+        </w:rPr>
+        <w:t xml:space="preserve">If asked before you fix it: </w:t>
+      </w:r>
+      <w:r>
+        <w:t>"That sentence overstates it and the Results section has the correct figures — 37 built a resume in the builder and 38 applied. All 46 registered and signed in. I would correct the summary to match the results table."</w:t>
       </w:r>
     </w:p>
     <w:p>
@@ -3106,37 +3345,509 @@
         <w:pStyle w:val="Heading2"/>
       </w:pPr>
       <w:r>
-        <w:t>Things in the system the manuscript does not fully describe</w:t>
-      </w:r>
-    </w:p>
-    <w:p>
-      <w:pPr/>
-      <w:r>
-        <w:t>The onboarding tour now appears once per page rather than on every visit, and its explanation card is positioned so it never covers the thing it's explaining.</w:t>
-      </w:r>
-    </w:p>
-    <w:p>
-      <w:pPr/>
-      <w:r>
-        <w:t>A skill can be linked to more than one source (for example, learned both at school and at a job).</w:t>
-      </w:r>
-    </w:p>
-    <w:p>
-      <w:pPr/>
-      <w:r>
-        <w:t>The recruiter enters minimum experience in YEARS; the system stores and scores it in months.</w:t>
-      </w:r>
-    </w:p>
-    <w:p>
-      <w:pPr/>
-      <w:r>
-        <w:t>There is a "college level (undergraduate)" step on the education ladder, between associate and bachelor.</w:t>
-      </w:r>
-    </w:p>
-    <w:p>
-      <w:pPr/>
-      <w:r>
-        <w:t>The required-skills field on the posting form is now a searchable dropdown over the full catalogue of skills, not a plain text box with a browser autocomplete list.</w:t>
+        <w:t>Defect 2 — an orphan paragraph left over from the Waterfall version</w:t>
+      </w:r>
+    </w:p>
+    <w:p>
+      <w:pPr>
+        <w:spacing w:after="60"/>
+      </w:pPr>
+      <w:r>
+        <w:rPr>
+          <w:b/>
+          <w:color w:val="16305C"/>
+        </w:rPr>
+        <w:t xml:space="preserve">Where: </w:t>
+      </w:r>
+      <w:r>
+        <w:t>In Design of Software, System, Product and Process, immediately after the Figure 2 paragraph.</w:t>
+      </w:r>
+    </w:p>
+    <w:p>
+      <w:pPr>
+        <w:spacing w:after="60"/>
+      </w:pPr>
+      <w:r>
+        <w:rPr>
+          <w:b/>
+          <w:color w:val="16305C"/>
+        </w:rPr>
+        <w:t xml:space="preserve">What it says: </w:t>
+      </w:r>
+      <w:r>
+        <w:t>"Two things soften that cost without breaking the model..."</w:t>
+      </w:r>
+    </w:p>
+    <w:p>
+      <w:pPr>
+        <w:spacing w:after="60"/>
+      </w:pPr>
+      <w:r>
+        <w:rPr>
+          <w:b/>
+          <w:color w:val="16305C"/>
+        </w:rPr>
+        <w:t xml:space="preserve">The problem: </w:t>
+      </w:r>
+      <w:r>
+        <w:t>There is no "cost" in the preceding Agile text for "that cost" to refer to. The phrase belonged to the old Waterfall justification, where the cost was that a fault revealed by the evaluation could not be fixed and re-rated. It also repeats the 232-tests sentence that appears in the sentence immediately before it, so the same claim is made twice in a row.</w:t>
+      </w:r>
+    </w:p>
+    <w:p>
+      <w:pPr>
+        <w:spacing w:after="60"/>
+      </w:pPr>
+      <w:r>
+        <w:rPr>
+          <w:b/>
+          <w:color w:val="16305C"/>
+        </w:rPr>
+        <w:t xml:space="preserve">The fix: </w:t>
+      </w:r>
+      <w:r>
+        <w:t>Either delete the paragraph, or rewrite its opening as "Two properties of this approach protect the evaluation" and delete the duplicated tests clause.</w:t>
+      </w:r>
+    </w:p>
+    <w:p>
+      <w:pPr>
+        <w:pStyle w:val="Heading2"/>
+      </w:pPr>
+      <w:r>
+        <w:t>Defect 3 — fourteen body paragraphs are formatted as Heading 1 or Heading 2</w:t>
+      </w:r>
+    </w:p>
+    <w:p>
+      <w:pPr>
+        <w:spacing w:after="60"/>
+      </w:pPr>
+      <w:r>
+        <w:rPr>
+          <w:b/>
+          <w:color w:val="16305C"/>
+        </w:rPr>
+        <w:t xml:space="preserve">Where: </w:t>
+      </w:r>
+      <w:r>
+        <w:t>Three in Results (the paragraphs beginning "Before the system was completed...", "This section presents the results of the HR...", and "All 10 HR respondents completed all ten tasks..."), one at the end of the IT Expert results, and ten across the Discussion — including all three objective statements and every interpretive paragraph.</w:t>
+      </w:r>
+    </w:p>
+    <w:p>
+      <w:pPr>
+        <w:spacing w:after="60"/>
+      </w:pPr>
+      <w:r>
+        <w:rPr>
+          <w:b/>
+          <w:color w:val="16305C"/>
+        </w:rPr>
+        <w:t xml:space="preserve">Why it matters: </w:t>
+      </w:r>
+      <w:r>
+        <w:t>They will render at heading size and weight, and if anyone updates a field or opens the navigation pane, whole paragraphs of body text appear as chapter headings. In a printed copy the Discussion will look like a list of enormous titles.</w:t>
+      </w:r>
+    </w:p>
+    <w:p>
+      <w:pPr>
+        <w:spacing w:after="60"/>
+      </w:pPr>
+      <w:r>
+        <w:rPr>
+          <w:b/>
+          <w:color w:val="16305C"/>
+        </w:rPr>
+        <w:t xml:space="preserve">The fix: </w:t>
+      </w:r>
+      <w:r>
+        <w:t>Select each and set it to Normal. The objective statements in the Discussion are the exception — those are genuine subheadings and should be Heading 2, not Heading 1.</w:t>
+      </w:r>
+    </w:p>
+    <w:p>
+      <w:pPr>
+        <w:pStyle w:val="Heading2"/>
+      </w:pPr>
+      <w:r>
+        <w:t>Defect 4 — twenty-five empty paragraphs carry a heading style</w:t>
+      </w:r>
+    </w:p>
+    <w:p>
+      <w:pPr>
+        <w:spacing w:after="60"/>
+      </w:pPr>
+      <w:r>
+        <w:rPr>
+          <w:b/>
+          <w:color w:val="16305C"/>
+        </w:rPr>
+        <w:t xml:space="preserve">Where: </w:t>
+      </w:r>
+      <w:r>
+        <w:t>Two in the literature review, one before Synthesis and Research Gap, six before the first results table, and eleven consecutive ones before Appendix D, among others.</w:t>
+      </w:r>
+    </w:p>
+    <w:p>
+      <w:pPr>
+        <w:spacing w:after="60"/>
+      </w:pPr>
+      <w:r>
+        <w:rPr>
+          <w:b/>
+          <w:color w:val="16305C"/>
+        </w:rPr>
+        <w:t xml:space="preserve">Why it matters: </w:t>
+      </w:r>
+      <w:r>
+        <w:t>Every one of them is a blank entry in the navigation pane, and would be a blank line in any generated table of contents. They are almost certainly spacing paragraphs that inherited the style of the heading above them.</w:t>
+      </w:r>
+    </w:p>
+    <w:p>
+      <w:pPr>
+        <w:spacing w:after="60"/>
+      </w:pPr>
+      <w:r>
+        <w:rPr>
+          <w:b/>
+          <w:color w:val="16305C"/>
+        </w:rPr>
+        <w:t xml:space="preserve">The fix: </w:t>
+      </w:r>
+      <w:r>
+        <w:t>Set them to Normal, or delete them and use paragraph spacing instead.</w:t>
+      </w:r>
+    </w:p>
+    <w:p>
+      <w:pPr>
+        <w:pStyle w:val="Heading2"/>
+      </w:pPr>
+      <w:r>
+        <w:t>Defect 5 — the Table of Contents is typed by hand and is incomplete</w:t>
+      </w:r>
+    </w:p>
+    <w:p>
+      <w:r>
+        <w:rPr>
+          <w:b w:val="0"/>
+          <w:i w:val="0"/>
+          <w:sz w:val="22"/>
+        </w:rPr>
+        <w:t>It is static text with typed page numbers, not a Word field, so it will not update. Three specific problems:</w:t>
+      </w:r>
+    </w:p>
+    <w:p>
+      <w:pPr>
+        <w:pStyle w:val="ListBullet"/>
+        <w:spacing w:after="60"/>
+      </w:pPr>
+      <w:r>
+        <w:t>Three Method subsections that exist in the body are missing from it: Project Timeline, Data Gathering Procedure, and Validity and Reliability of the Instrument.</w:t>
+      </w:r>
+    </w:p>
+    <w:p>
+      <w:pPr>
+        <w:pStyle w:val="ListBullet"/>
+        <w:spacing w:after="60"/>
+      </w:pPr>
+      <w:r>
+        <w:t>Summary of Findings is missing entirely, although it is a Heading 1 in the body and sits between Results and Discussion.</w:t>
+      </w:r>
+    </w:p>
+    <w:p>
+      <w:pPr>
+        <w:pStyle w:val="ListBullet"/>
+        <w:spacing w:after="60"/>
+      </w:pPr>
+      <w:r>
+        <w:t>The front-matter page numbers are out of order as listed: Table of Contents is given as iv, Title Page as vi, and List of Figures and Tables as v — so vi is listed above v.</w:t>
+      </w:r>
+    </w:p>
+    <w:p>
+      <w:pPr>
+        <w:spacing w:after="60"/>
+      </w:pPr>
+      <w:r>
+        <w:rPr>
+          <w:b/>
+          <w:color w:val="16305C"/>
+        </w:rPr>
+        <w:t xml:space="preserve">The fix: </w:t>
+      </w:r>
+      <w:r>
+        <w:t>Either correct the three omissions and the ordering by hand, or replace it with a real Word TOC field so it maintains itself. If you keep it manual, check every page number after the final layout.</w:t>
+      </w:r>
+    </w:p>
+    <w:p>
+      <w:pPr>
+        <w:pStyle w:val="Heading2"/>
+      </w:pPr>
+      <w:r>
+        <w:t>Defect 6 — two references to a section that does not exist</w:t>
+      </w:r>
+    </w:p>
+    <w:p>
+      <w:pPr>
+        <w:spacing w:after="60"/>
+      </w:pPr>
+      <w:r>
+        <w:rPr>
+          <w:b/>
+          <w:color w:val="16305C"/>
+        </w:rPr>
+        <w:t xml:space="preserve">Where: </w:t>
+      </w:r>
+      <w:r>
+        <w:t>The Data Analysis section says the SUS mean "is reported beside both reference points named in the Definition of Terms". The note under Table 10 says both reference points "were fixed in advance, in the Definition of Terms and the Data Analysis section".</w:t>
+      </w:r>
+    </w:p>
+    <w:p>
+      <w:pPr>
+        <w:spacing w:after="60"/>
+      </w:pPr>
+      <w:r>
+        <w:rPr>
+          <w:b/>
+          <w:color w:val="16305C"/>
+        </w:rPr>
+        <w:t xml:space="preserve">The problem: </w:t>
+      </w:r>
+      <w:r>
+        <w:t>There is no Definition of Terms section in this manuscript. The key terms are now defined at the start of the Review of Related Literature, and the two SUS benchmarks are not among them.</w:t>
+      </w:r>
+    </w:p>
+    <w:p>
+      <w:pPr>
+        <w:spacing w:after="60"/>
+      </w:pPr>
+      <w:r>
+        <w:rPr>
+          <w:b/>
+          <w:color w:val="16305C"/>
+        </w:rPr>
+        <w:t xml:space="preserve">The fix: </w:t>
+      </w:r>
+      <w:r>
+        <w:t>Change both to "named in the Data Analysis section", which is where they actually appear, and make sure both benchmarks are stated there before the Results use them.</w:t>
+      </w:r>
+    </w:p>
+    <w:p>
+      <w:pPr>
+        <w:pStyle w:val="Heading2"/>
+      </w:pPr>
+      <w:r>
+        <w:t>Defect 7 — the cover page title is singular</w:t>
+      </w:r>
+    </w:p>
+    <w:p>
+      <w:pPr>
+        <w:spacing w:after="60"/>
+      </w:pPr>
+      <w:r>
+        <w:rPr>
+          <w:b/>
+          <w:color w:val="16305C"/>
+        </w:rPr>
+        <w:t xml:space="preserve">What it says: </w:t>
+      </w:r>
+      <w:r>
+        <w:t>The cover page reads "...FOR JOB SEEKER AND PARTNER COMPANIES IN THE PHILIPPINES".</w:t>
+      </w:r>
+    </w:p>
+    <w:p>
+      <w:pPr>
+        <w:spacing w:after="60"/>
+      </w:pPr>
+      <w:r>
+        <w:rPr>
+          <w:b/>
+          <w:color w:val="16305C"/>
+        </w:rPr>
+        <w:t xml:space="preserve">Everywhere else: </w:t>
+      </w:r>
+      <w:r>
+        <w:t>The approval sheet, the title page, the running head and the consent form all read "JOB SEEKERS".</w:t>
+      </w:r>
+    </w:p>
+    <w:p>
+      <w:pPr>
+        <w:spacing w:after="60"/>
+      </w:pPr>
+      <w:r>
+        <w:rPr>
+          <w:b/>
+          <w:color w:val="16305C"/>
+        </w:rPr>
+        <w:t xml:space="preserve">The fix: </w:t>
+      </w:r>
+      <w:r>
+        <w:t>One word on page one. Add the S.</w:t>
+      </w:r>
+    </w:p>
+    <w:p>
+      <w:pPr>
+        <w:pStyle w:val="Heading2"/>
+      </w:pPr>
+      <w:r>
+        <w:t>Defect 8 — the third objective loses its number in the Discussion</w:t>
+      </w:r>
+    </w:p>
+    <w:p>
+      <w:pPr>
+        <w:spacing w:after="60"/>
+      </w:pPr>
+      <w:r>
+        <w:rPr>
+          <w:b/>
+          <w:color w:val="16305C"/>
+        </w:rPr>
+        <w:t xml:space="preserve">Where: </w:t>
+      </w:r>
+      <w:r>
+        <w:t>In the Discussion, objectives 1 and 2 are introduced as "1. To design and develop..." and "2. To implement...". The third begins "To evaluate the system's functional suitability..." with no "3.".</w:t>
+      </w:r>
+    </w:p>
+    <w:p>
+      <w:pPr>
+        <w:spacing w:after="60"/>
+      </w:pPr>
+      <w:r>
+        <w:rPr>
+          <w:b/>
+          <w:color w:val="16305C"/>
+        </w:rPr>
+        <w:t xml:space="preserve">The fix: </w:t>
+      </w:r>
+      <w:r>
+        <w:t>Add the number, so the three blocks read consistently.</w:t>
+      </w:r>
+    </w:p>
+    <w:p>
+      <w:pPr>
+        <w:pStyle w:val="Heading2"/>
+      </w:pPr>
+      <w:r>
+        <w:t>Defect 9 — "uploaded a file" and "used AI extraction" are used interchangeably</w:t>
+      </w:r>
+    </w:p>
+    <w:p>
+      <w:pPr>
+        <w:spacing w:after="60"/>
+      </w:pPr>
+      <w:r>
+        <w:rPr>
+          <w:b/>
+          <w:color w:val="16305C"/>
+        </w:rPr>
+        <w:t xml:space="preserve">Where: </w:t>
+      </w:r>
+      <w:r>
+        <w:t>Results: "Twenty-eight uploaded a resume file of their own, the least completed task." Summary of Findings: "twenty-eight used the optional AI-assisted resume extraction feature."</w:t>
+      </w:r>
+    </w:p>
+    <w:p>
+      <w:pPr>
+        <w:spacing w:after="60"/>
+      </w:pPr>
+      <w:r>
+        <w:rPr>
+          <w:b/>
+          <w:color w:val="16305C"/>
+        </w:rPr>
+        <w:t xml:space="preserve">The problem: </w:t>
+      </w:r>
+      <w:r>
+        <w:t>They are the same 28 respondents but they are not the same claim. Uploading a file and having a language model extract it into fields are separate steps in the system.</w:t>
+      </w:r>
+    </w:p>
+    <w:p>
+      <w:pPr>
+        <w:spacing w:after="60"/>
+      </w:pPr>
+      <w:r>
+        <w:rPr>
+          <w:b/>
+          <w:color w:val="16305C"/>
+        </w:rPr>
+        <w:t xml:space="preserve">The fix: </w:t>
+      </w:r>
+      <w:r>
+        <w:t>Pick one wording and use it in both places. "Uploaded a resume file" is the safer claim, because it is what the instrument item actually asked.</w:t>
+      </w:r>
+    </w:p>
+    <w:p>
+      <w:pPr>
+        <w:pStyle w:val="Heading2"/>
+      </w:pPr>
+      <w:r>
+        <w:t>Defect 10 — the abstract claims more than the study measured</w:t>
+      </w:r>
+    </w:p>
+    <w:p>
+      <w:pPr>
+        <w:spacing w:after="60"/>
+      </w:pPr>
+      <w:r>
+        <w:rPr>
+          <w:b/>
+          <w:color w:val="16305C"/>
+        </w:rPr>
+        <w:t xml:space="preserve">What it says: </w:t>
+      </w:r>
+      <w:r>
+        <w:t>The abstract says the study "examines how a transparent, rule-based scoring formula affects the accuracy and perceived fairness of resume-to-posting matching... and how a centralized dashboard affects the speed and consistency of recruiter screening".</w:t>
+      </w:r>
+    </w:p>
+    <w:p>
+      <w:pPr>
+        <w:spacing w:after="60"/>
+      </w:pPr>
+      <w:r>
+        <w:rPr>
+          <w:b/>
+          <w:color w:val="16305C"/>
+        </w:rPr>
+        <w:t xml:space="preserve">The problem: </w:t>
+      </w:r>
+      <w:r>
+        <w:t>Accuracy, perceived fairness, speed and consistency are not measured anywhere. What is measured is functional suitability, usability, reliability, security and maintainability, plus the SUS. The nearest item to a speed claim — whether the ranked list was quicker than current practice — is the joint-lowest HR item at 4.00.</w:t>
+      </w:r>
+    </w:p>
+    <w:p>
+      <w:pPr>
+        <w:spacing w:after="60"/>
+      </w:pPr>
+      <w:r>
+        <w:rPr>
+          <w:b/>
+          <w:color w:val="16305C"/>
+        </w:rPr>
+        <w:t xml:space="preserve">The fix: </w:t>
+      </w:r>
+      <w:r>
+        <w:t>Rewrite that sentence to name what was actually measured. It is the one paragraph a panelist is guaranteed to read closely.</w:t>
+      </w:r>
+    </w:p>
+    <w:p>
+      <w:pPr>
+        <w:pStyle w:val="Heading1"/>
+      </w:pPr>
+      <w:r>
+        <w:t>5. Two Things Worth Volunteering Before You Are Asked</w:t>
+      </w:r>
+    </w:p>
+    <w:p>
+      <w:pPr>
+        <w:pStyle w:val="ListNumber"/>
+        <w:spacing w:after="60"/>
+      </w:pPr>
+      <w:r>
+        <w:t>The HR group is 11 before and 10 after. One respondent completed the pre-use instrument and not the post-use one. Say so plainly if the numbers are queried — Instrument B was answered by 11 and Instrument D by 10.</w:t>
+      </w:r>
+    </w:p>
+    <w:p>
+      <w:pPr>
+        <w:pStyle w:val="ListNumber"/>
+        <w:spacing w:after="60"/>
+      </w:pPr>
+      <w:r>
+        <w:t>Instrument C collects no demographic information, so the before-group of 46 and the after-group of 46 cannot be shown to resemble each other on any measured characteristic. The paper already lists fixing this as a recommendation for future research, so quote your own recommendation rather than being caught by the question.</w:t>
       </w:r>
     </w:p>
     <w:sectPr>

</xml_diff>

<commit_message>
Reframe the independence limitation to match what the paper claims
The previous wording ("we built it and we evaluated it") read as though
the researchers rated their own system. They did not: every rating came
from an external respondent -- 46 job seekers, 11 HR personnel and 3 IT
experts. The manuscript's actual claim is narrower: respondents rated a
system built by the people who wrote the instruments and recruited them,
which is a favourable-response bias, not self-rating.

Reworded across all four reviewers and both decks to lead with the
external respondents and concede only what the paper concedes.

Co-Authored-By: Claude Opus 5 <noreply@anthropic.com>
Claude-Session: https://claude.ai/code/session_01KJCBhwXyDj1kaiQWF9G7ZP
</commit_message>
<xml_diff>
--- a/05_Website_Angular/docs/reviewer-4/02_Manuscript_Reviewer.docx
+++ b/05_Website_Angular/docs/reviewer-4/02_Manuscript_Reviewer.docx
@@ -1477,7 +1477,7 @@
         <w:spacing w:after="60"/>
       </w:pPr>
       <w:r>
-        <w:t>Volunteer the self-evaluation bias FIRST. It is the one the panel is going to raise anyway.</w:t>
+        <w:t>Volunteer the independence limitation FIRST — but state it precisely. NONE of you rated the system; every rating came from an external respondent. What you concede is that you wrote the instruments and recruited the people who answered them, and they knew whose system it was.</w:t>
       </w:r>
     </w:p>
     <w:p>
@@ -1501,7 +1501,7 @@
         <w:t xml:space="preserve">How to explain it to the panel: </w:t>
       </w:r>
       <w:r>
-        <w:t>"The biggest one is that we built the system and we are also the ones evaluating it. We put four procedures in place to limit that, but we cannot remove it, and we say so. The second is that it is one company in one industry, so our findings describe this pilot, not Philippine recruitment generally."</w:t>
+        <w:t>"The biggest one is that the study is not independent of us. None of us rated the system — every rating came from an outside respondent — but we wrote the instruments and recruited the people who answered them, and they knew whose system it was. We put four procedures in place to limit that, but we cannot remove it, and we say so. The second is that it is one company in one industry, so our findings describe this pilot, not Philippine recruitment generally."</w:t>
       </w:r>
     </w:p>
     <w:p>
@@ -1531,7 +1531,7 @@
         <w:t xml:space="preserve">Simple answer: </w:t>
       </w:r>
       <w:r>
-        <w:t>"That we evaluate our own system. We limit it by keeping responses confidential, having no researcher present while people answer, telling respondents that critical ratings are as useful as positive ones, and publishing the interpretation scale before collecting any data. That limits the bias. It does not remove it."</w:t>
+        <w:t>"That the study is not independent of the people who built the system — though be exact about what that means. None of us rated it. Every rating came from an outside respondent. What we concede is that we wrote the instruments and recruited the people who answered them. We limit it by keeping responses confidential, having no researcher present while people answer, telling respondents that critical ratings are as useful as positive ones, and publishing the interpretation scale before collecting any data. That limits the bias. It does not remove it."</w:t>
       </w:r>
     </w:p>
     <w:p>

</xml_diff>